<commit_message>
fix: fixing bugs, pinned messages logic in frontend, editing messages, buttons group and direct, avatars on sidebar.
</commit_message>
<xml_diff>
--- a/docs/report.docx
+++ b/docs/report.docx
@@ -7798,10 +7798,10 @@
           <w:lang w:val="en-US"/>
         </w:rPr>
         <w:drawing>
-          <wp:inline distT="0" distB="0" distL="0" distR="0" wp14:anchorId="686075FC" wp14:editId="579B3563">
-            <wp:extent cx="2673240" cy="4320000"/>
-            <wp:effectExtent l="0" t="0" r="0" b="4445"/>
-            <wp:docPr id="828532160" name="Рисунок 1"/>
+          <wp:inline distT="0" distB="0" distL="0" distR="0" wp14:anchorId="12E88DD3" wp14:editId="765EF3B7">
+            <wp:extent cx="2671200" cy="3903644"/>
+            <wp:effectExtent l="0" t="0" r="0" b="1905"/>
+            <wp:docPr id="698208079" name="Рисунок 1"/>
             <wp:cNvGraphicFramePr>
               <a:graphicFrameLocks xmlns:a="http://schemas.openxmlformats.org/drawingml/2006/main" noChangeAspect="1"/>
             </wp:cNvGraphicFramePr>
@@ -7809,7 +7809,7 @@
               <a:graphicData uri="http://schemas.openxmlformats.org/drawingml/2006/picture">
                 <pic:pic xmlns:pic="http://schemas.openxmlformats.org/drawingml/2006/picture">
                   <pic:nvPicPr>
-                    <pic:cNvPr id="828532160" name=""/>
+                    <pic:cNvPr id="698208079" name=""/>
                     <pic:cNvPicPr/>
                   </pic:nvPicPr>
                   <pic:blipFill>
@@ -7821,7 +7821,7 @@
                   <pic:spPr>
                     <a:xfrm>
                       <a:off x="0" y="0"/>
-                      <a:ext cx="2673240" cy="4320000"/>
+                      <a:ext cx="2671200" cy="3903644"/>
                     </a:xfrm>
                     <a:prstGeom prst="rect">
                       <a:avLst/>
@@ -7882,14 +7882,14 @@
         <w:rPr>
           <w:lang/>
         </w:rPr>
-        <w:t xml:space="preserve">Центральную часть интерфейса занимает окно активного диалога. В верхней части окна (Header) отображается текущий статус собеседника и инструменты управления конкретным чатом, включая поиск по истории сообщений и панель детальной информации. Одной из ключевых </w:t>
+        <w:t xml:space="preserve">Центральную часть интерфейса занимает окно активного диалога. В верхней части окна (Header) отображается текущий статус собеседника и инструменты управления конкретным чатом, включая поиск по истории сообщений и панель детальной информации. Одной из ключевых особенностей интерфейса является закрепленная область для важных </w:t>
       </w:r>
       <w:r>
         <w:rPr>
           <w:lang/>
         </w:rPr>
         <w:lastRenderedPageBreak/>
-        <w:t>особенностей интерфейса является закрепленная область для важных сообщений (Pinned Messages), расположенная непосредственно под заголовком чата.</w:t>
+        <w:t>сообщений (Pinned Messages), расположенная непосредственно под заголовком чата.</w:t>
       </w:r>
     </w:p>
     <w:p>

</xml_diff>

<commit_message>
fix: Styles and visual updated
</commit_message>
<xml_diff>
--- a/docs/report.docx
+++ b/docs/report.docx
@@ -86,6 +86,13 @@
     <w:p>
       <w:pPr>
         <w:spacing w:line="240" w:lineRule="auto"/>
+        <w:ind w:firstLine="0"/>
+        <w:jc w:val="center"/>
+      </w:pPr>
+    </w:p>
+    <w:p>
+      <w:pPr>
+        <w:spacing w:line="240" w:lineRule="auto"/>
         <w:ind w:left="4960" w:firstLine="0"/>
         <w:jc w:val="center"/>
       </w:pPr>
@@ -243,7 +250,7 @@
           <w:b/>
           <w:bCs/>
         </w:rPr>
-        <w:t>РАЗРАБОТКА МНОГОЯЗЫЧНОГО КАЛЕНДАРЯ, УВЕДОМЛЯЮЩЕГО О ДНЯХ РОЖДЕНИЯ, ГОДОВЩИНАХ И ДРУГИХ СОБЫТИЯХ</w:t>
+        <w:t>КОРПОРАТИВНЫЙ МЕССЕНДЖЕР</w:t>
       </w:r>
       <w:r>
         <w:rPr>
@@ -267,6 +274,16 @@
         <w:spacing w:line="240" w:lineRule="auto"/>
         <w:ind w:firstLine="0"/>
         <w:jc w:val="center"/>
+        <w:rPr>
+          <w:b/>
+        </w:rPr>
+      </w:pPr>
+    </w:p>
+    <w:p>
+      <w:pPr>
+        <w:spacing w:line="240" w:lineRule="auto"/>
+        <w:ind w:firstLine="0"/>
+        <w:jc w:val="center"/>
       </w:pPr>
       <w:r>
         <w:t>БГУИР КП 6-05-0612-02 01</w:t>
@@ -277,6 +294,13 @@
       <w:r>
         <w:t xml:space="preserve"> ПЗ</w:t>
       </w:r>
+    </w:p>
+    <w:p>
+      <w:pPr>
+        <w:spacing w:line="240" w:lineRule="auto"/>
+        <w:ind w:firstLine="0"/>
+        <w:jc w:val="center"/>
+      </w:pPr>
     </w:p>
     <w:p>
       <w:pPr>
@@ -557,7 +581,6 @@
               <w:kern w:val="2"/>
               <w:sz w:val="24"/>
               <w:szCs w:val="24"/>
-              <w:lang/>
               <w14:ligatures w14:val="standardContextual"/>
             </w:rPr>
           </w:pPr>
@@ -644,7 +667,6 @@
               <w:kern w:val="2"/>
               <w:sz w:val="24"/>
               <w:szCs w:val="24"/>
-              <w:lang/>
               <w14:ligatures w14:val="standardContextual"/>
             </w:rPr>
           </w:pPr>
@@ -726,7 +748,6 @@
               <w:kern w:val="2"/>
               <w:sz w:val="24"/>
               <w:szCs w:val="24"/>
-              <w:lang/>
               <w14:ligatures w14:val="standardContextual"/>
             </w:rPr>
           </w:pPr>
@@ -801,7 +822,6 @@
               <w:kern w:val="2"/>
               <w:sz w:val="24"/>
               <w:szCs w:val="24"/>
-              <w:lang/>
               <w14:ligatures w14:val="standardContextual"/>
             </w:rPr>
           </w:pPr>
@@ -872,7 +892,6 @@
               <w:kern w:val="2"/>
               <w:sz w:val="24"/>
               <w:szCs w:val="24"/>
-              <w:lang/>
               <w14:ligatures w14:val="standardContextual"/>
             </w:rPr>
           </w:pPr>
@@ -954,7 +973,6 @@
               <w:kern w:val="2"/>
               <w:sz w:val="24"/>
               <w:szCs w:val="24"/>
-              <w:lang/>
               <w14:ligatures w14:val="standardContextual"/>
             </w:rPr>
           </w:pPr>
@@ -1029,7 +1047,6 @@
               <w:kern w:val="2"/>
               <w:sz w:val="24"/>
               <w:szCs w:val="24"/>
-              <w:lang/>
               <w14:ligatures w14:val="standardContextual"/>
             </w:rPr>
           </w:pPr>
@@ -1104,7 +1121,6 @@
               <w:kern w:val="2"/>
               <w:sz w:val="24"/>
               <w:szCs w:val="24"/>
-              <w:lang/>
               <w14:ligatures w14:val="standardContextual"/>
             </w:rPr>
           </w:pPr>
@@ -1179,7 +1195,6 @@
               <w:kern w:val="2"/>
               <w:sz w:val="24"/>
               <w:szCs w:val="24"/>
-              <w:lang/>
               <w14:ligatures w14:val="standardContextual"/>
             </w:rPr>
           </w:pPr>
@@ -1254,7 +1269,6 @@
               <w:kern w:val="2"/>
               <w:sz w:val="24"/>
               <w:szCs w:val="24"/>
-              <w:lang/>
               <w14:ligatures w14:val="standardContextual"/>
             </w:rPr>
           </w:pPr>
@@ -1329,7 +1343,6 @@
               <w:kern w:val="2"/>
               <w:sz w:val="24"/>
               <w:szCs w:val="24"/>
-              <w:lang/>
               <w14:ligatures w14:val="standardContextual"/>
             </w:rPr>
           </w:pPr>
@@ -1400,7 +1413,6 @@
               <w:kern w:val="2"/>
               <w:sz w:val="24"/>
               <w:szCs w:val="24"/>
-              <w:lang/>
               <w14:ligatures w14:val="standardContextual"/>
             </w:rPr>
           </w:pPr>
@@ -1482,7 +1494,6 @@
               <w:kern w:val="2"/>
               <w:sz w:val="24"/>
               <w:szCs w:val="24"/>
-              <w:lang/>
               <w14:ligatures w14:val="standardContextual"/>
             </w:rPr>
           </w:pPr>
@@ -1557,7 +1568,6 @@
               <w:kern w:val="2"/>
               <w:sz w:val="24"/>
               <w:szCs w:val="24"/>
-              <w:lang/>
               <w14:ligatures w14:val="standardContextual"/>
             </w:rPr>
           </w:pPr>
@@ -1632,7 +1642,6 @@
               <w:kern w:val="2"/>
               <w:sz w:val="24"/>
               <w:szCs w:val="24"/>
-              <w:lang/>
               <w14:ligatures w14:val="standardContextual"/>
             </w:rPr>
           </w:pPr>
@@ -1707,7 +1716,6 @@
               <w:kern w:val="2"/>
               <w:sz w:val="24"/>
               <w:szCs w:val="24"/>
-              <w:lang/>
               <w14:ligatures w14:val="standardContextual"/>
             </w:rPr>
           </w:pPr>
@@ -1782,7 +1790,6 @@
               <w:kern w:val="2"/>
               <w:sz w:val="24"/>
               <w:szCs w:val="24"/>
-              <w:lang/>
               <w14:ligatures w14:val="standardContextual"/>
             </w:rPr>
           </w:pPr>
@@ -1857,7 +1864,6 @@
               <w:kern w:val="2"/>
               <w:sz w:val="24"/>
               <w:szCs w:val="24"/>
-              <w:lang/>
               <w14:ligatures w14:val="standardContextual"/>
             </w:rPr>
           </w:pPr>
@@ -1866,24 +1872,8 @@
               <w:rPr>
                 <w:rStyle w:val="af1"/>
                 <w:noProof/>
-                <w:lang/>
-              </w:rPr>
-              <w:t>3.2.</w:t>
-            </w:r>
-            <w:r>
-              <w:rPr>
-                <w:rStyle w:val="af1"/>
-                <w:noProof/>
-              </w:rPr>
-              <w:t>4</w:t>
-            </w:r>
-            <w:r>
-              <w:rPr>
-                <w:rStyle w:val="af1"/>
-                <w:noProof/>
-                <w:lang/>
-              </w:rPr>
-              <w:t xml:space="preserve"> Модель базы данных</w:t>
+              </w:rPr>
+              <w:t>3.2.4 Модель базы данных</w:t>
             </w:r>
             <w:r>
               <w:rPr>
@@ -1948,7 +1938,6 @@
               <w:kern w:val="2"/>
               <w:sz w:val="24"/>
               <w:szCs w:val="24"/>
-              <w:lang/>
               <w14:ligatures w14:val="standardContextual"/>
             </w:rPr>
           </w:pPr>
@@ -1957,7 +1946,6 @@
               <w:rPr>
                 <w:rStyle w:val="af1"/>
                 <w:noProof/>
-                <w:lang/>
               </w:rPr>
               <w:t>3.3 Реализация клиентской части</w:t>
             </w:r>
@@ -2024,7 +2012,6 @@
               <w:kern w:val="2"/>
               <w:sz w:val="24"/>
               <w:szCs w:val="24"/>
-              <w:lang/>
               <w14:ligatures w14:val="standardContextual"/>
             </w:rPr>
           </w:pPr>
@@ -2033,7 +2020,6 @@
               <w:rPr>
                 <w:rStyle w:val="af1"/>
                 <w:noProof/>
-                <w:lang/>
               </w:rPr>
               <w:t>3.3.1 Общая структура фронтенда</w:t>
             </w:r>
@@ -2100,7 +2086,6 @@
               <w:kern w:val="2"/>
               <w:sz w:val="24"/>
               <w:szCs w:val="24"/>
-              <w:lang/>
               <w14:ligatures w14:val="standardContextual"/>
             </w:rPr>
           </w:pPr>
@@ -2124,15 +2109,7 @@
                 <w:rStyle w:val="af1"/>
                 <w:noProof/>
               </w:rPr>
-              <w:t xml:space="preserve">.2 </w:t>
-            </w:r>
-            <w:r>
-              <w:rPr>
-                <w:rStyle w:val="af1"/>
-                <w:noProof/>
-                <w:lang/>
-              </w:rPr>
-              <w:t>Пользовательский интерфейс</w:t>
+              <w:t>.2 Пользовательский интерфейс</w:t>
             </w:r>
             <w:r>
               <w:rPr>
@@ -2193,7 +2170,6 @@
               <w:kern w:val="2"/>
               <w:sz w:val="24"/>
               <w:szCs w:val="24"/>
-              <w:lang/>
               <w14:ligatures w14:val="standardContextual"/>
             </w:rPr>
           </w:pPr>
@@ -2202,17 +2178,22 @@
               <w:rPr>
                 <w:rStyle w:val="af1"/>
                 <w:noProof/>
-                <w:lang/>
-              </w:rPr>
-              <w:t>4 Р</w:t>
+              </w:rPr>
+              <w:t xml:space="preserve">4 </w:t>
             </w:r>
             <w:r>
               <w:rPr>
                 <w:rStyle w:val="af1"/>
                 <w:noProof/>
-                <w:lang/>
-              </w:rPr>
-              <w:t>азвертывание и тестирование</w:t>
+              </w:rPr>
+              <w:t>Т</w:t>
+            </w:r>
+            <w:r>
+              <w:rPr>
+                <w:rStyle w:val="af1"/>
+                <w:noProof/>
+              </w:rPr>
+              <w:t>естирование</w:t>
             </w:r>
             <w:r>
               <w:rPr>
@@ -2273,7 +2254,6 @@
               <w:kern w:val="2"/>
               <w:sz w:val="24"/>
               <w:szCs w:val="24"/>
-              <w:lang/>
               <w14:ligatures w14:val="standardContextual"/>
             </w:rPr>
           </w:pPr>
@@ -2351,7 +2331,6 @@
               <w:kern w:val="2"/>
               <w:sz w:val="24"/>
               <w:szCs w:val="24"/>
-              <w:lang/>
               <w14:ligatures w14:val="standardContextual"/>
             </w:rPr>
           </w:pPr>
@@ -3175,7 +3154,13 @@
         <w:t xml:space="preserve"> и платформа ASP.NET Core</w:t>
       </w:r>
       <w:r>
-        <w:t xml:space="preserve"> [3]</w:t>
+        <w:t xml:space="preserve"> [</w:t>
+      </w:r>
+      <w:r>
+        <w:t>2</w:t>
+      </w:r>
+      <w:r>
+        <w:t>]</w:t>
       </w:r>
       <w:r>
         <w:t>. Данный выбор обусловлен широкими возможностями, которые предоставляет экосистема .NET для создания современных веб-приложений, а также высокой производительностью и надежностью реализуемых решений.</w:t>
@@ -3186,15 +3171,36 @@
         <w:spacing w:line="360" w:lineRule="exact"/>
       </w:pPr>
       <w:r>
-        <w:t>Язык C# является современным объектно-ориентированным языком программирования, обладающим строгой типизацией, развитой системой управления памятью и удобным синтаксисом. Он активно используется при разработке корпоративных систем различного уровня сложности и позволяет создавать масштабируемые и поддерживаемые приложения. Важным преимуществом C# является его интеграция с платформой .NET, которая предоставляет разработчику большое количество готовых инструментов и библиотек для решения типовых задач.</w:t>
-      </w:r>
-    </w:p>
-    <w:p>
-      <w:pPr>
-        <w:spacing w:line="360" w:lineRule="exact"/>
-      </w:pPr>
-      <w:r>
-        <w:t>Платформа ASP.NET Core представляет собой кроссплатформенный фреймворк для разработки веб-приложений и веб-сервисов. Она позволяет создавать как классические веб-приложения, так и Web API, обеспечивающие взаимодействие между серверной и клиентской частями системы. Одним из ключевых преимуществ ASP.NET Core является высокая производительность, достигаемая за счёт оптимизированной архитектуры и асинхронной обработки запросов. Кроме того, платформа поддерживает гибкую настройку маршрутизации, встроенные механизмы внедрения зависимостей и средства обеспечения безопасности.</w:t>
+        <w:t>Язык C#</w:t>
+      </w:r>
+      <w:r>
+        <w:t xml:space="preserve"> [2]</w:t>
+      </w:r>
+      <w:r>
+        <w:t xml:space="preserve"> является современным объектно-ориентированным языком программирования, обладающим строгой типизацией, развитой системой управления памятью и удобным синтаксисом. Он активно используется при разработке корпоративных систем различного уровня сложности и позволяет создавать масштабируемые и поддерживаемые приложения. Важным преимуществом C# является его интеграция с платформой .NET, которая предоставляет разработчику большое количество готовых инструментов и библиотек для решения типовых задач.</w:t>
+      </w:r>
+    </w:p>
+    <w:p>
+      <w:pPr>
+        <w:spacing w:line="360" w:lineRule="exact"/>
+      </w:pPr>
+      <w:r>
+        <w:t xml:space="preserve">Платформа ASP.NET Core </w:t>
+      </w:r>
+      <w:r>
+        <w:t>[</w:t>
+      </w:r>
+      <w:r>
+        <w:t>2</w:t>
+      </w:r>
+      <w:r>
+        <w:t>]</w:t>
+      </w:r>
+      <w:r>
+        <w:t xml:space="preserve"> </w:t>
+      </w:r>
+      <w:r>
+        <w:t>представляет собой кроссплатформенный фреймворк для разработки веб-приложений и веб-сервисов. Она позволяет создавать как классические веб-приложения, так и Web API, обеспечивающие взаимодействие между серверной и клиентской частями системы. Одним из ключевых преимуществ ASP.NET Core является высокая производительность, достигаемая за счёт оптимизированной архитектуры и асинхронной обработки запросов. Кроме того, платформа поддерживает гибкую настройку маршрутизации, встроенные механизмы внедрения зависимостей и средства обеспечения безопасности.</w:t>
       </w:r>
     </w:p>
     <w:p>
@@ -3397,6 +3403,18 @@
       </w:r>
       <w:proofErr w:type="spellEnd"/>
       <w:r>
+        <w:t xml:space="preserve"> </w:t>
+      </w:r>
+      <w:r>
+        <w:t>[</w:t>
+      </w:r>
+      <w:r>
+        <w:t>3</w:t>
+      </w:r>
+      <w:r>
+        <w:t>]</w:t>
+      </w:r>
+      <w:r>
         <w:t>. Данная технология позволяет установить двусторонний канал связи, в рамках которого сервер может отправлять данные клиенту без необходимости постоянных запросов с его стороны. Это обеспечивает мгновенную доставку сообщений и делает взаимодействие пользователей максимально приближенным к реальному времени.</w:t>
       </w:r>
     </w:p>
@@ -3543,6 +3561,18 @@
       </w:r>
       <w:proofErr w:type="spellEnd"/>
       <w:r>
+        <w:t xml:space="preserve"> </w:t>
+      </w:r>
+      <w:r>
+        <w:t>[</w:t>
+      </w:r>
+      <w:r>
+        <w:t>3</w:t>
+      </w:r>
+      <w:r>
+        <w:t>]</w:t>
+      </w:r>
+      <w:r>
         <w:t xml:space="preserve"> и автоматически выбирает наиболее подходящий способ передачи данных в зависимости от возможностей клиента и сервера. Это значительно упрощает разработку и позволяет сосредоточиться на логике приложения, не углубляясь </w:t>
       </w:r>
       <w:r>
@@ -3616,6 +3646,18 @@
       </w:r>
       <w:proofErr w:type="spellEnd"/>
       <w:r>
+        <w:t xml:space="preserve"> </w:t>
+      </w:r>
+      <w:r>
+        <w:t>[</w:t>
+      </w:r>
+      <w:r>
+        <w:t>4</w:t>
+      </w:r>
+      <w:r>
+        <w:t>]</w:t>
+      </w:r>
+      <w:r>
         <w:t xml:space="preserve">. Данный выбор обусловлен высокой надежностью, производительностью и поддержкой сложных запросов, что делает </w:t>
       </w:r>
       <w:proofErr w:type="spellStart"/>
@@ -3648,7 +3690,30 @@
       </w:r>
       <w:proofErr w:type="spellEnd"/>
       <w:r>
-        <w:t xml:space="preserve"> Framework Core — объектно-реляционное отображение (ORM), позволяющее работать с данными на уровне объектов. Это значительно упрощает разработку, так как избавляет от необходимости писать сложные SQL-запросы вручную и позволяет использовать возможности языка C# для управления данными.</w:t>
+        <w:t xml:space="preserve"> Framework </w:t>
+      </w:r>
+      <w:proofErr w:type="gramStart"/>
+      <w:r>
+        <w:t xml:space="preserve">Core </w:t>
+      </w:r>
+      <w:r>
+        <w:t xml:space="preserve"> </w:t>
+      </w:r>
+      <w:r>
+        <w:t>[</w:t>
+      </w:r>
+      <w:proofErr w:type="gramEnd"/>
+      <w:r>
+        <w:t>5</w:t>
+      </w:r>
+      <w:r>
+        <w:t>]</w:t>
+      </w:r>
+      <w:r>
+        <w:t xml:space="preserve"> </w:t>
+      </w:r>
+      <w:r>
+        <w:t>— объектно-реляционное отображение (ORM), позволяющее работать с данными на уровне объектов. Это значительно упрощает разработку, так как избавляет от необходимости писать сложные SQL-запросы вручную и позволяет использовать возможности языка C# для управления данными.</w:t>
       </w:r>
     </w:p>
     <w:p>
@@ -3661,7 +3726,22 @@
       </w:r>
       <w:proofErr w:type="spellEnd"/>
       <w:r>
-        <w:t xml:space="preserve"> Framework Core поддерживает механизм миграций, который позволяет изменять структуру базы данных без потери данных. Это особенно важно в процессе разработки, когда структура приложения может изменяться и дополняться новыми сущностями.</w:t>
+        <w:t xml:space="preserve"> Framework Core поддерживает механизм миграций</w:t>
+      </w:r>
+      <w:r>
+        <w:t xml:space="preserve"> </w:t>
+      </w:r>
+      <w:r>
+        <w:t>[</w:t>
+      </w:r>
+      <w:r>
+        <w:t>5</w:t>
+      </w:r>
+      <w:r>
+        <w:t>]</w:t>
+      </w:r>
+      <w:r>
+        <w:t>, который позволяет изменять структуру базы данных без потери данных. Это особенно важно в процессе разработки, когда структура приложения может изменяться и дополняться новыми сущностями.</w:t>
       </w:r>
     </w:p>
     <w:p>
@@ -3806,7 +3886,16 @@
       </w:r>
       <w:proofErr w:type="spellEnd"/>
       <w:r>
-        <w:t xml:space="preserve"> Architecture. Такой подход позволяет разделить систему на логические уровни, каждый из которых отвечает за определённую часть функциональности.</w:t>
+        <w:t xml:space="preserve"> Architecture</w:t>
+      </w:r>
+      <w:r>
+        <w:t xml:space="preserve"> </w:t>
+      </w:r>
+      <w:r>
+        <w:t>[6]</w:t>
+      </w:r>
+      <w:r>
+        <w:t>. Такой подход позволяет разделить систему на логические уровни, каждый из которых отвечает за определённую часть функциональности.</w:t>
       </w:r>
     </w:p>
     <w:p>
@@ -3834,7 +3923,16 @@
         <w:spacing w:line="360" w:lineRule="exact"/>
       </w:pPr>
       <w:r>
-        <w:t>Уровень приложения (Application) реализует основную бизнес-логику системы и построен с использованием паттерна CQRS. Для организации взаимодействия между компонентами применяется библиотека MediatR, которая позволяет разделить команды (изменяющие состояние) и запросы (чтение данных), а также обеспечить слабую связанность между обработчиками и вызывающим кодом.</w:t>
+        <w:t>Уровень приложения (Application) реализует основную бизнес-логику системы и построен с использованием паттерна CQRS</w:t>
+      </w:r>
+      <w:r>
+        <w:t xml:space="preserve"> </w:t>
+      </w:r>
+      <w:r>
+        <w:t>[7]</w:t>
+      </w:r>
+      <w:r>
+        <w:t>. Для организации взаимодействия между компонентами применяется библиотека MediatR, которая позволяет разделить команды (изменяющие состояние) и запросы (чтение данных), а также обеспечить слабую связанность между обработчиками и вызывающим кодом.</w:t>
       </w:r>
     </w:p>
     <w:p>
@@ -3850,7 +3948,21 @@
         <w:spacing w:line="360" w:lineRule="exact"/>
       </w:pPr>
       <w:r>
-        <w:t>Таким образом, взаимодействие между слоями построено через четко определённые абстракции: контроллеры передают запросы в слой Application через MediatR, обработчики используют Unit of Work и репозитории из слоя Infrastructure, что обеспечивает модульность, тестируемость и расширяемость системы.</w:t>
+        <w:t xml:space="preserve">Таким образом, взаимодействие между слоями построено через четко определённые абстракции: контроллеры передают запросы в слой Application через </w:t>
+      </w:r>
+      <w:proofErr w:type="spellStart"/>
+      <w:r>
+        <w:t>MediatR</w:t>
+      </w:r>
+      <w:proofErr w:type="spellEnd"/>
+      <w:r>
+        <w:t xml:space="preserve"> </w:t>
+      </w:r>
+      <w:r>
+        <w:t>[8]</w:t>
+      </w:r>
+      <w:r>
+        <w:t>, обработчики используют Unit of Work и репозитории из слоя Infrastructure, что обеспечивает модульность, тестируемость и расширяемость системы.</w:t>
       </w:r>
     </w:p>
     <w:p>
@@ -4038,6 +4150,12 @@
       </w:r>
       <w:proofErr w:type="spellEnd"/>
       <w:r>
+        <w:t xml:space="preserve"> </w:t>
+      </w:r>
+      <w:r>
+        <w:t>[9]</w:t>
+      </w:r>
+      <w:r>
         <w:t xml:space="preserve">. Выбор данной технологии обусловлен её компонентно-ориентированным подходом, который позволяет эффективно разделять интерфейс на независимые логические модули, упрощая поддержку и масштабирование системы. </w:t>
       </w:r>
     </w:p>
@@ -4167,6 +4285,12 @@
       </w:r>
       <w:proofErr w:type="spellEnd"/>
       <w:r>
+        <w:t xml:space="preserve"> </w:t>
+      </w:r>
+      <w:r>
+        <w:t>[10]</w:t>
+      </w:r>
+      <w:r>
         <w:t xml:space="preserve"> и технологии JSON Web </w:t>
       </w:r>
       <w:proofErr w:type="spellStart"/>
@@ -4309,15 +4433,38 @@
         <w:spacing w:line="360" w:lineRule="exact"/>
       </w:pPr>
       <w:r>
-        <w:t>Серверная часть приложения реализована с использованием технологии ASP.NET Core и представляет собой Web API, отвечающий за обработку входящих запросов, выполнение бизнес-логики и взаимодействие с базой данных. Сервер выступает центральным элементом системы, обеспечивая управление пользователями, чатами и сообщениями, а также реализуя механизмы аутентификации, авторизации и обеспечения безопасности. Вся логика обработки данных сосредоточена на сервере, что позволяет минимизировать нагрузку на клиентскую часть и обеспечить целостность и контроль над данными.</w:t>
-      </w:r>
-    </w:p>
-    <w:p>
-      <w:pPr>
-        <w:spacing w:line="360" w:lineRule="exact"/>
-      </w:pPr>
-      <w:r>
-        <w:t>Клиентская часть реализована в виде одностраничного веб-приложения с использованием библиотеки React. Данный подход позволяет обеспечить высокую отзывчивость интерфейса и комфортное взаимодействие пользователя с системой без необходимости полной перезагрузки страниц. Клиент отвечает за отображение данных, обработку пользовательских действий и формирование запросов к серверу, а также за установление соединения для обмена сообщениями в реальном времени.</w:t>
+        <w:t>Серверная часть приложения реализована с использованием технологии ASP.NET Core</w:t>
+      </w:r>
+      <w:r>
+        <w:t xml:space="preserve"> </w:t>
+      </w:r>
+      <w:r>
+        <w:t>[2]</w:t>
+      </w:r>
+      <w:r>
+        <w:t xml:space="preserve"> и представляет собой Web API, отвечающий за обработку входящих запросов, выполнение бизнес-логики и взаимодействие с базой данных. Сервер выступает центральным элементом системы, обеспечивая управление пользователями, чатами и сообщениями, а также реализуя механизмы аутентификации, авторизации и обеспечения безопасности. Вся логика обработки данных сосредоточена на сервере, что позволяет минимизировать нагрузку на клиентскую часть и обеспечить целостность и контроль над данными.</w:t>
+      </w:r>
+    </w:p>
+    <w:p>
+      <w:pPr>
+        <w:spacing w:line="360" w:lineRule="exact"/>
+      </w:pPr>
+      <w:r>
+        <w:t xml:space="preserve">Клиентская часть реализована в виде одностраничного веб-приложения с использованием библиотеки </w:t>
+      </w:r>
+      <w:proofErr w:type="spellStart"/>
+      <w:r>
+        <w:t>React</w:t>
+      </w:r>
+      <w:proofErr w:type="spellEnd"/>
+      <w:r>
+        <w:t xml:space="preserve"> </w:t>
+      </w:r>
+      <w:r>
+        <w:t>[9]</w:t>
+      </w:r>
+      <w:r>
+        <w:t>. Данный подход позволяет обеспечить высокую отзывчивость интерфейса и комфортное взаимодействие пользователя с системой без необходимости полной перезагрузки страниц. Клиент отвечает за отображение данных, обработку пользовательских действий и формирование запросов к серверу, а также за установление соединения для обмена сообщениями в реальном времени.</w:t>
       </w:r>
     </w:p>
     <w:p>
@@ -4333,7 +4480,21 @@
         <w:spacing w:line="360" w:lineRule="exact"/>
       </w:pPr>
       <w:r>
-        <w:t>Для реализации обмена сообщениями в реальном времени используется технология SignalR, позволяющая установить постоянное двустороннее соединение между клиентом и сервером. В отличие от классической модели взаимодействия по HTTP, данный подход позволяет серверу самостоятельно инициировать отправку данных клиенту, что обеспечивает мгновенную доставку сообщений и актуализацию данных без необходимости периодических запросов. Это особенно важно для мессенджера, где критическим требованием является минимальная задержка при передаче сообщений.</w:t>
+        <w:t xml:space="preserve">Для реализации обмена сообщениями в реальном времени используется технология </w:t>
+      </w:r>
+      <w:proofErr w:type="spellStart"/>
+      <w:r>
+        <w:t>SignalR</w:t>
+      </w:r>
+      <w:proofErr w:type="spellEnd"/>
+      <w:r>
+        <w:t xml:space="preserve"> </w:t>
+      </w:r>
+      <w:r>
+        <w:t>[3]</w:t>
+      </w:r>
+      <w:r>
+        <w:t>, позволяющая установить постоянное двустороннее соединение между клиентом и сервером. В отличие от классической модели взаимодействия по HTTP, данный подход позволяет серверу самостоятельно инициировать отправку данных клиенту, что обеспечивает мгновенную доставку сообщений и актуализацию данных без необходимости периодических запросов. Это особенно важно для мессенджера, где критическим требованием является минимальная задержка при передаче сообщений.</w:t>
       </w:r>
     </w:p>
     <w:p>
@@ -5054,19 +5215,75 @@
         <w:spacing w:line="360" w:lineRule="exact"/>
       </w:pPr>
       <w:r>
-        <w:t>В ходе разработки архитектуры серверной части были применены фундаментальные паттерны проектирования, обеспечивающие модульность, тестируемость и слабую связанность компонентов системы. Основу архитектурного взаимодействия составляет паттерн Mediator, реализованный с помощью библиотеки MediatR. Он позволяет инкапсулировать логику обработки запросов в отдельных обработчиках, исключая прямые зависимости между слоем API и бизнес-логикой. Это неразрывно связано с паттерном CQRS (Command Query Responsibility Segregation), который разделяет модель системы на две части: команды для изменения состояния и запросы для получения данных, что оптимизирует производительность и упрощает поддержку каждой из моделей.</w:t>
-      </w:r>
-    </w:p>
-    <w:p>
-      <w:pPr>
-        <w:spacing w:line="360" w:lineRule="exact"/>
-      </w:pPr>
-      <w:r>
-        <w:t xml:space="preserve">Для управления доступом к данным и абстрагирования от деталей реализации ORM (Entity Framework Core) применены паттерны Repository (Репозиторий) и Unit of Work (Единица работы). Репозитории предоставляют </w:t>
+        <w:t xml:space="preserve">В ходе разработки архитектуры серверной части были применены фундаментальные паттерны проектирования, обеспечивающие модульность, тестируемость и слабую связанность компонентов системы. Основу архитектурного взаимодействия составляет паттерн Mediator, реализованный с помощью библиотеки </w:t>
+      </w:r>
+      <w:proofErr w:type="spellStart"/>
+      <w:r>
+        <w:t>MediatR</w:t>
+      </w:r>
+      <w:proofErr w:type="spellEnd"/>
+      <w:r>
+        <w:t xml:space="preserve"> </w:t>
+      </w:r>
+      <w:r>
+        <w:t>[8]</w:t>
+      </w:r>
+      <w:r>
+        <w:t xml:space="preserve">. Он позволяет инкапсулировать логику обработки запросов в отдельных обработчиках, исключая прямые зависимости между слоем API и бизнес-логикой. Это неразрывно связано с паттерном CQRS (Command </w:t>
+      </w:r>
+      <w:proofErr w:type="spellStart"/>
+      <w:r>
+        <w:t>Query</w:t>
+      </w:r>
+      <w:proofErr w:type="spellEnd"/>
+      <w:r>
+        <w:t xml:space="preserve"> </w:t>
+      </w:r>
+      <w:proofErr w:type="spellStart"/>
+      <w:r>
+        <w:t>Responsibility</w:t>
+      </w:r>
+      <w:proofErr w:type="spellEnd"/>
+      <w:r>
+        <w:t xml:space="preserve"> </w:t>
+      </w:r>
+      <w:proofErr w:type="spellStart"/>
+      <w:r>
+        <w:t>Segregation</w:t>
+      </w:r>
+      <w:proofErr w:type="spellEnd"/>
+      <w:r>
+        <w:t>)</w:t>
+      </w:r>
+      <w:r>
+        <w:t xml:space="preserve"> </w:t>
+      </w:r>
+      <w:r>
+        <w:t>[7]</w:t>
+      </w:r>
+      <w:r>
+        <w:t>, который разделяет модель системы на две части: команды для изменения состояния и запросы для получения данных, что оптимизирует производительность и упрощает поддержку каждой из моделей.</w:t>
+      </w:r>
+    </w:p>
+    <w:p>
+      <w:pPr>
+        <w:spacing w:line="360" w:lineRule="exact"/>
+      </w:pPr>
+      <w:r>
+        <w:t>Для управления доступом к данным и абстрагирования от деталей реализации ORM (Entity Framework Core) применены паттерны Repository (Репозиторий) и Unit of Work (Единица работы)</w:t>
+      </w:r>
+      <w:r>
+        <w:t xml:space="preserve"> </w:t>
+      </w:r>
+      <w:r>
+        <w:t>[11]</w:t>
+      </w:r>
+      <w:r>
+        <w:t xml:space="preserve">. Репозитории </w:t>
       </w:r>
       <w:r>
         <w:lastRenderedPageBreak/>
-        <w:t>коллекции для работы с доменными сущностями, скрывая сложность SQL-запросов, а Unit of Work гарантирует атомарность операций, позволяя выполнить группу действий в рамках единой транзакции базы данных. Такой подход обеспечивает целостность информации при выполнении сложных бизнес-сценариев, таких как создание группового чата с одновременным добавлением нескольких участников.</w:t>
+        <w:t>предоставляют коллекции для работы с доменными сущностями, скрывая сложность SQL-запросов, а Unit of Work гарантирует атомарность операций, позволяя выполнить группу действий в рамках единой транзакции базы данных. Такой подход обеспечивает целостность информации при выполнении сложных бизнес-сценариев, таких как создание группового чата с одновременным добавлением нескольких участников.</w:t>
       </w:r>
     </w:p>
     <w:p>
@@ -5267,23 +5484,12 @@
     </w:p>
     <w:p/>
     <w:p>
-      <w:pPr>
-        <w:rPr>
-          <w:lang/>
-        </w:rPr>
-      </w:pPr>
-      <w:r>
-        <w:rPr>
-          <w:lang/>
-        </w:rPr>
+      <w:r>
         <w:t>Взаимодействие между клиентской и серверной частями мессенджера организовано посредством REST-ориентированного программного интерфейса. Проектирование эндпоинтов выполнено с соблюдением принципов семантики HTTP-методов, где GET используется для получения данных, POST — для создания новых ресурсов, PUT и PATCH — для полной или частичной модификации, а DELETE — для их удаления. Все данные передаются в формате JSON, что обеспечивает легкость интеграции и высокую скорость парсинга на стороне клиента.</w:t>
       </w:r>
     </w:p>
     <w:p>
       <w:r>
-        <w:rPr>
-          <w:lang/>
-        </w:rPr>
         <w:t>Для обеспечения безопасности большинство конечных точек защищены механизмом авторизации. Доступ к ним возможен только при наличии в заголовке запроса (Authorization) валидного JWT-токена, выданного сервером при успешном входе в систему. Исключение составляют эндпоинты регистрации и аутентификации, которые находятся в открытом доступе</w:t>
       </w:r>
     </w:p>
@@ -5313,14 +5519,8 @@
             <w:pPr>
               <w:ind w:firstLine="0"/>
               <w:jc w:val="center"/>
-              <w:rPr>
-                <w:lang/>
-              </w:rPr>
             </w:pPr>
             <w:r>
-              <w:rPr>
-                <w:lang/>
-              </w:rPr>
               <w:t>Метод</w:t>
             </w:r>
           </w:p>
@@ -5335,14 +5535,8 @@
               <w:ind w:firstLine="0"/>
               <w:jc w:val="center"/>
               <w:cnfStyle w:val="100000000000" w:firstRow="1" w:lastRow="0" w:firstColumn="0" w:lastColumn="0" w:oddVBand="0" w:evenVBand="0" w:oddHBand="0" w:evenHBand="0" w:firstRowFirstColumn="0" w:firstRowLastColumn="0" w:lastRowFirstColumn="0" w:lastRowLastColumn="0"/>
-              <w:rPr>
-                <w:lang/>
-              </w:rPr>
             </w:pPr>
             <w:r>
-              <w:rPr>
-                <w:lang/>
-              </w:rPr>
               <w:t>URL</w:t>
             </w:r>
           </w:p>
@@ -5357,14 +5551,8 @@
               <w:ind w:firstLine="0"/>
               <w:jc w:val="center"/>
               <w:cnfStyle w:val="100000000000" w:firstRow="1" w:lastRow="0" w:firstColumn="0" w:lastColumn="0" w:oddVBand="0" w:evenVBand="0" w:oddHBand="0" w:evenHBand="0" w:firstRowFirstColumn="0" w:firstRowLastColumn="0" w:lastRowFirstColumn="0" w:lastRowLastColumn="0"/>
-              <w:rPr>
-                <w:lang/>
-              </w:rPr>
             </w:pPr>
             <w:r>
-              <w:rPr>
-                <w:lang/>
-              </w:rPr>
               <w:t>Описание</w:t>
             </w:r>
           </w:p>
@@ -5385,14 +5573,12 @@
               <w:rPr>
                 <w:b w:val="0"/>
                 <w:bCs w:val="0"/>
-                <w:lang/>
               </w:rPr>
             </w:pPr>
             <w:r>
               <w:rPr>
                 <w:b w:val="0"/>
                 <w:bCs w:val="0"/>
-                <w:lang/>
               </w:rPr>
               <w:t>POST</w:t>
             </w:r>
@@ -5409,14 +5595,8 @@
               <w:ind w:firstLine="0"/>
               <w:jc w:val="center"/>
               <w:cnfStyle w:val="000000000000" w:firstRow="0" w:lastRow="0" w:firstColumn="0" w:lastColumn="0" w:oddVBand="0" w:evenVBand="0" w:oddHBand="0" w:evenHBand="0" w:firstRowFirstColumn="0" w:firstRowLastColumn="0" w:lastRowFirstColumn="0" w:lastRowLastColumn="0"/>
-              <w:rPr>
-                <w:lang/>
-              </w:rPr>
             </w:pPr>
             <w:r>
-              <w:rPr>
-                <w:lang/>
-              </w:rPr>
               <w:t>/api/user/register</w:t>
             </w:r>
           </w:p>
@@ -5432,14 +5612,8 @@
               <w:ind w:firstLine="0"/>
               <w:jc w:val="center"/>
               <w:cnfStyle w:val="000000000000" w:firstRow="0" w:lastRow="0" w:firstColumn="0" w:lastColumn="0" w:oddVBand="0" w:evenVBand="0" w:oddHBand="0" w:evenHBand="0" w:firstRowFirstColumn="0" w:firstRowLastColumn="0" w:lastRowFirstColumn="0" w:lastRowLastColumn="0"/>
-              <w:rPr>
-                <w:lang/>
-              </w:rPr>
             </w:pPr>
             <w:r>
-              <w:rPr>
-                <w:lang/>
-              </w:rPr>
               <w:t>Регистрация нового пользователя</w:t>
             </w:r>
           </w:p>
@@ -5460,14 +5634,12 @@
               <w:rPr>
                 <w:b w:val="0"/>
                 <w:bCs w:val="0"/>
-                <w:lang/>
               </w:rPr>
             </w:pPr>
             <w:r>
               <w:rPr>
                 <w:b w:val="0"/>
                 <w:bCs w:val="0"/>
-                <w:lang/>
               </w:rPr>
               <w:t>POST</w:t>
             </w:r>
@@ -5484,14 +5656,8 @@
               <w:ind w:firstLine="0"/>
               <w:jc w:val="center"/>
               <w:cnfStyle w:val="000000000000" w:firstRow="0" w:lastRow="0" w:firstColumn="0" w:lastColumn="0" w:oddVBand="0" w:evenVBand="0" w:oddHBand="0" w:evenHBand="0" w:firstRowFirstColumn="0" w:firstRowLastColumn="0" w:lastRowFirstColumn="0" w:lastRowLastColumn="0"/>
-              <w:rPr>
-                <w:lang/>
-              </w:rPr>
             </w:pPr>
             <w:r>
-              <w:rPr>
-                <w:lang/>
-              </w:rPr>
               <w:t>/api/user/login</w:t>
             </w:r>
           </w:p>
@@ -5507,14 +5673,8 @@
               <w:ind w:firstLine="0"/>
               <w:jc w:val="center"/>
               <w:cnfStyle w:val="000000000000" w:firstRow="0" w:lastRow="0" w:firstColumn="0" w:lastColumn="0" w:oddVBand="0" w:evenVBand="0" w:oddHBand="0" w:evenHBand="0" w:firstRowFirstColumn="0" w:firstRowLastColumn="0" w:lastRowFirstColumn="0" w:lastRowLastColumn="0"/>
-              <w:rPr>
-                <w:lang/>
-              </w:rPr>
             </w:pPr>
             <w:r>
-              <w:rPr>
-                <w:lang/>
-              </w:rPr>
               <w:t>Аутентификация пользователя и получение JWT-токена</w:t>
             </w:r>
           </w:p>
@@ -5535,14 +5695,12 @@
               <w:rPr>
                 <w:b w:val="0"/>
                 <w:bCs w:val="0"/>
-                <w:lang/>
               </w:rPr>
             </w:pPr>
             <w:r>
               <w:rPr>
                 <w:b w:val="0"/>
                 <w:bCs w:val="0"/>
-                <w:lang/>
               </w:rPr>
               <w:lastRenderedPageBreak/>
               <w:t>GET</w:t>
@@ -5560,14 +5718,8 @@
               <w:ind w:firstLine="0"/>
               <w:jc w:val="center"/>
               <w:cnfStyle w:val="000000000000" w:firstRow="0" w:lastRow="0" w:firstColumn="0" w:lastColumn="0" w:oddVBand="0" w:evenVBand="0" w:oddHBand="0" w:evenHBand="0" w:firstRowFirstColumn="0" w:firstRowLastColumn="0" w:lastRowFirstColumn="0" w:lastRowLastColumn="0"/>
-              <w:rPr>
-                <w:lang/>
-              </w:rPr>
             </w:pPr>
             <w:r>
-              <w:rPr>
-                <w:lang/>
-              </w:rPr>
               <w:t>/api/user/me</w:t>
             </w:r>
           </w:p>
@@ -5583,14 +5735,8 @@
               <w:ind w:firstLine="0"/>
               <w:jc w:val="center"/>
               <w:cnfStyle w:val="000000000000" w:firstRow="0" w:lastRow="0" w:firstColumn="0" w:lastColumn="0" w:oddVBand="0" w:evenVBand="0" w:oddHBand="0" w:evenHBand="0" w:firstRowFirstColumn="0" w:firstRowLastColumn="0" w:lastRowFirstColumn="0" w:lastRowLastColumn="0"/>
-              <w:rPr>
-                <w:lang/>
-              </w:rPr>
             </w:pPr>
             <w:r>
-              <w:rPr>
-                <w:lang/>
-              </w:rPr>
               <w:t>Получение информации о текущем пользователе</w:t>
             </w:r>
           </w:p>
@@ -5611,14 +5757,12 @@
               <w:rPr>
                 <w:b w:val="0"/>
                 <w:bCs w:val="0"/>
-                <w:lang/>
               </w:rPr>
             </w:pPr>
             <w:r>
               <w:rPr>
                 <w:b w:val="0"/>
                 <w:bCs w:val="0"/>
-                <w:lang/>
               </w:rPr>
               <w:t>PUT</w:t>
             </w:r>
@@ -5635,14 +5779,8 @@
               <w:ind w:firstLine="0"/>
               <w:jc w:val="center"/>
               <w:cnfStyle w:val="000000000000" w:firstRow="0" w:lastRow="0" w:firstColumn="0" w:lastColumn="0" w:oddVBand="0" w:evenVBand="0" w:oddHBand="0" w:evenHBand="0" w:firstRowFirstColumn="0" w:firstRowLastColumn="0" w:lastRowFirstColumn="0" w:lastRowLastColumn="0"/>
-              <w:rPr>
-                <w:lang/>
-              </w:rPr>
             </w:pPr>
             <w:r>
-              <w:rPr>
-                <w:lang/>
-              </w:rPr>
               <w:t>/api/user/profile</w:t>
             </w:r>
           </w:p>
@@ -5658,14 +5796,8 @@
               <w:ind w:firstLine="0"/>
               <w:jc w:val="center"/>
               <w:cnfStyle w:val="000000000000" w:firstRow="0" w:lastRow="0" w:firstColumn="0" w:lastColumn="0" w:oddVBand="0" w:evenVBand="0" w:oddHBand="0" w:evenHBand="0" w:firstRowFirstColumn="0" w:firstRowLastColumn="0" w:lastRowFirstColumn="0" w:lastRowLastColumn="0"/>
-              <w:rPr>
-                <w:lang/>
-              </w:rPr>
             </w:pPr>
             <w:r>
-              <w:rPr>
-                <w:lang/>
-              </w:rPr>
               <w:t>Обновление профиля пользователя</w:t>
             </w:r>
           </w:p>
@@ -5686,14 +5818,12 @@
               <w:rPr>
                 <w:b w:val="0"/>
                 <w:bCs w:val="0"/>
-                <w:lang/>
               </w:rPr>
             </w:pPr>
             <w:r>
               <w:rPr>
                 <w:b w:val="0"/>
                 <w:bCs w:val="0"/>
-                <w:lang/>
               </w:rPr>
               <w:t>GET</w:t>
             </w:r>
@@ -5710,14 +5840,8 @@
               <w:ind w:firstLine="0"/>
               <w:jc w:val="center"/>
               <w:cnfStyle w:val="000000000000" w:firstRow="0" w:lastRow="0" w:firstColumn="0" w:lastColumn="0" w:oddVBand="0" w:evenVBand="0" w:oddHBand="0" w:evenHBand="0" w:firstRowFirstColumn="0" w:firstRowLastColumn="0" w:lastRowFirstColumn="0" w:lastRowLastColumn="0"/>
-              <w:rPr>
-                <w:lang/>
-              </w:rPr>
             </w:pPr>
             <w:r>
-              <w:rPr>
-                <w:lang/>
-              </w:rPr>
               <w:t>/api/user/search</w:t>
             </w:r>
           </w:p>
@@ -5733,14 +5857,8 @@
               <w:ind w:firstLine="0"/>
               <w:jc w:val="center"/>
               <w:cnfStyle w:val="000000000000" w:firstRow="0" w:lastRow="0" w:firstColumn="0" w:lastColumn="0" w:oddVBand="0" w:evenVBand="0" w:oddHBand="0" w:evenHBand="0" w:firstRowFirstColumn="0" w:firstRowLastColumn="0" w:lastRowFirstColumn="0" w:lastRowLastColumn="0"/>
-              <w:rPr>
-                <w:lang/>
-              </w:rPr>
             </w:pPr>
             <w:r>
-              <w:rPr>
-                <w:lang/>
-              </w:rPr>
               <w:t>Поиск пользователей по имени</w:t>
             </w:r>
           </w:p>
@@ -5761,14 +5879,12 @@
               <w:rPr>
                 <w:b w:val="0"/>
                 <w:bCs w:val="0"/>
-                <w:lang/>
               </w:rPr>
             </w:pPr>
             <w:r>
               <w:rPr>
                 <w:b w:val="0"/>
                 <w:bCs w:val="0"/>
-                <w:lang/>
               </w:rPr>
               <w:t>POST</w:t>
             </w:r>
@@ -5785,14 +5901,8 @@
               <w:ind w:firstLine="0"/>
               <w:jc w:val="center"/>
               <w:cnfStyle w:val="000000000000" w:firstRow="0" w:lastRow="0" w:firstColumn="0" w:lastColumn="0" w:oddVBand="0" w:evenVBand="0" w:oddHBand="0" w:evenHBand="0" w:firstRowFirstColumn="0" w:firstRowLastColumn="0" w:lastRowFirstColumn="0" w:lastRowLastColumn="0"/>
-              <w:rPr>
-                <w:lang/>
-              </w:rPr>
             </w:pPr>
             <w:r>
-              <w:rPr>
-                <w:lang/>
-              </w:rPr>
               <w:t>/api/user/avatar</w:t>
             </w:r>
           </w:p>
@@ -5808,14 +5918,8 @@
               <w:ind w:firstLine="0"/>
               <w:jc w:val="center"/>
               <w:cnfStyle w:val="000000000000" w:firstRow="0" w:lastRow="0" w:firstColumn="0" w:lastColumn="0" w:oddVBand="0" w:evenVBand="0" w:oddHBand="0" w:evenHBand="0" w:firstRowFirstColumn="0" w:firstRowLastColumn="0" w:lastRowFirstColumn="0" w:lastRowLastColumn="0"/>
-              <w:rPr>
-                <w:lang/>
-              </w:rPr>
             </w:pPr>
             <w:r>
-              <w:rPr>
-                <w:lang/>
-              </w:rPr>
               <w:t>Загрузка аватара пользователя</w:t>
             </w:r>
           </w:p>
@@ -5836,14 +5940,12 @@
               <w:rPr>
                 <w:b w:val="0"/>
                 <w:bCs w:val="0"/>
-                <w:lang/>
               </w:rPr>
             </w:pPr>
             <w:r>
               <w:rPr>
                 <w:b w:val="0"/>
                 <w:bCs w:val="0"/>
-                <w:lang/>
               </w:rPr>
               <w:t>GET</w:t>
             </w:r>
@@ -5860,14 +5962,8 @@
               <w:ind w:firstLine="0"/>
               <w:jc w:val="center"/>
               <w:cnfStyle w:val="000000000000" w:firstRow="0" w:lastRow="0" w:firstColumn="0" w:lastColumn="0" w:oddVBand="0" w:evenVBand="0" w:oddHBand="0" w:evenHBand="0" w:firstRowFirstColumn="0" w:firstRowLastColumn="0" w:lastRowFirstColumn="0" w:lastRowLastColumn="0"/>
-              <w:rPr>
-                <w:lang/>
-              </w:rPr>
             </w:pPr>
             <w:r>
-              <w:rPr>
-                <w:lang/>
-              </w:rPr>
               <w:t>/api/chats</w:t>
             </w:r>
           </w:p>
@@ -5883,14 +5979,8 @@
               <w:ind w:firstLine="0"/>
               <w:jc w:val="center"/>
               <w:cnfStyle w:val="000000000000" w:firstRow="0" w:lastRow="0" w:firstColumn="0" w:lastColumn="0" w:oddVBand="0" w:evenVBand="0" w:oddHBand="0" w:evenHBand="0" w:firstRowFirstColumn="0" w:firstRowLastColumn="0" w:lastRowFirstColumn="0" w:lastRowLastColumn="0"/>
-              <w:rPr>
-                <w:lang/>
-              </w:rPr>
             </w:pPr>
             <w:r>
-              <w:rPr>
-                <w:lang/>
-              </w:rPr>
               <w:t>Получение списка чатов пользователя</w:t>
             </w:r>
           </w:p>
@@ -5911,14 +6001,12 @@
               <w:rPr>
                 <w:b w:val="0"/>
                 <w:bCs w:val="0"/>
-                <w:lang/>
               </w:rPr>
             </w:pPr>
             <w:r>
               <w:rPr>
                 <w:b w:val="0"/>
                 <w:bCs w:val="0"/>
-                <w:lang/>
               </w:rPr>
               <w:t>GET</w:t>
             </w:r>
@@ -5935,14 +6023,8 @@
               <w:ind w:firstLine="0"/>
               <w:jc w:val="center"/>
               <w:cnfStyle w:val="000000000000" w:firstRow="0" w:lastRow="0" w:firstColumn="0" w:lastColumn="0" w:oddVBand="0" w:evenVBand="0" w:oddHBand="0" w:evenHBand="0" w:firstRowFirstColumn="0" w:firstRowLastColumn="0" w:lastRowFirstColumn="0" w:lastRowLastColumn="0"/>
-              <w:rPr>
-                <w:lang/>
-              </w:rPr>
             </w:pPr>
             <w:r>
-              <w:rPr>
-                <w:lang/>
-              </w:rPr>
               <w:t>/api/chats/{id}</w:t>
             </w:r>
           </w:p>
@@ -5958,14 +6040,8 @@
               <w:ind w:firstLine="0"/>
               <w:jc w:val="center"/>
               <w:cnfStyle w:val="000000000000" w:firstRow="0" w:lastRow="0" w:firstColumn="0" w:lastColumn="0" w:oddVBand="0" w:evenVBand="0" w:oddHBand="0" w:evenHBand="0" w:firstRowFirstColumn="0" w:firstRowLastColumn="0" w:lastRowFirstColumn="0" w:lastRowLastColumn="0"/>
-              <w:rPr>
-                <w:lang/>
-              </w:rPr>
             </w:pPr>
             <w:r>
-              <w:rPr>
-                <w:lang/>
-              </w:rPr>
               <w:t>Получение детальной информации о чате</w:t>
             </w:r>
           </w:p>
@@ -5986,14 +6062,12 @@
               <w:rPr>
                 <w:b w:val="0"/>
                 <w:bCs w:val="0"/>
-                <w:lang/>
               </w:rPr>
             </w:pPr>
             <w:r>
               <w:rPr>
                 <w:b w:val="0"/>
                 <w:bCs w:val="0"/>
-                <w:lang/>
               </w:rPr>
               <w:t>POST</w:t>
             </w:r>
@@ -6010,14 +6084,8 @@
               <w:ind w:firstLine="0"/>
               <w:jc w:val="center"/>
               <w:cnfStyle w:val="000000000000" w:firstRow="0" w:lastRow="0" w:firstColumn="0" w:lastColumn="0" w:oddVBand="0" w:evenVBand="0" w:oddHBand="0" w:evenHBand="0" w:firstRowFirstColumn="0" w:firstRowLastColumn="0" w:lastRowFirstColumn="0" w:lastRowLastColumn="0"/>
-              <w:rPr>
-                <w:lang/>
-              </w:rPr>
             </w:pPr>
             <w:r>
-              <w:rPr>
-                <w:lang/>
-              </w:rPr>
               <w:t>/api/chats/direct</w:t>
             </w:r>
           </w:p>
@@ -6033,14 +6101,8 @@
               <w:ind w:firstLine="0"/>
               <w:jc w:val="center"/>
               <w:cnfStyle w:val="000000000000" w:firstRow="0" w:lastRow="0" w:firstColumn="0" w:lastColumn="0" w:oddVBand="0" w:evenVBand="0" w:oddHBand="0" w:evenHBand="0" w:firstRowFirstColumn="0" w:firstRowLastColumn="0" w:lastRowFirstColumn="0" w:lastRowLastColumn="0"/>
-              <w:rPr>
-                <w:lang/>
-              </w:rPr>
             </w:pPr>
             <w:r>
-              <w:rPr>
-                <w:lang/>
-              </w:rPr>
               <w:t>Создание личного чата</w:t>
             </w:r>
           </w:p>
@@ -6061,14 +6123,12 @@
               <w:rPr>
                 <w:b w:val="0"/>
                 <w:bCs w:val="0"/>
-                <w:lang/>
               </w:rPr>
             </w:pPr>
             <w:r>
               <w:rPr>
                 <w:b w:val="0"/>
                 <w:bCs w:val="0"/>
-                <w:lang/>
               </w:rPr>
               <w:t>POST</w:t>
             </w:r>
@@ -6085,14 +6145,8 @@
               <w:ind w:firstLine="0"/>
               <w:jc w:val="center"/>
               <w:cnfStyle w:val="000000000000" w:firstRow="0" w:lastRow="0" w:firstColumn="0" w:lastColumn="0" w:oddVBand="0" w:evenVBand="0" w:oddHBand="0" w:evenHBand="0" w:firstRowFirstColumn="0" w:firstRowLastColumn="0" w:lastRowFirstColumn="0" w:lastRowLastColumn="0"/>
-              <w:rPr>
-                <w:lang/>
-              </w:rPr>
             </w:pPr>
             <w:r>
-              <w:rPr>
-                <w:lang/>
-              </w:rPr>
               <w:t>/api/chats/group</w:t>
             </w:r>
           </w:p>
@@ -6108,14 +6162,8 @@
               <w:ind w:firstLine="0"/>
               <w:jc w:val="center"/>
               <w:cnfStyle w:val="000000000000" w:firstRow="0" w:lastRow="0" w:firstColumn="0" w:lastColumn="0" w:oddVBand="0" w:evenVBand="0" w:oddHBand="0" w:evenHBand="0" w:firstRowFirstColumn="0" w:firstRowLastColumn="0" w:lastRowFirstColumn="0" w:lastRowLastColumn="0"/>
-              <w:rPr>
-                <w:lang/>
-              </w:rPr>
             </w:pPr>
             <w:r>
-              <w:rPr>
-                <w:lang/>
-              </w:rPr>
               <w:t>Создание группового чата или канала</w:t>
             </w:r>
           </w:p>
@@ -6136,14 +6184,12 @@
               <w:rPr>
                 <w:b w:val="0"/>
                 <w:bCs w:val="0"/>
-                <w:lang/>
               </w:rPr>
             </w:pPr>
             <w:r>
               <w:rPr>
                 <w:b w:val="0"/>
                 <w:bCs w:val="0"/>
-                <w:lang/>
               </w:rPr>
               <w:t>POST</w:t>
             </w:r>
@@ -6160,14 +6206,8 @@
               <w:ind w:firstLine="0"/>
               <w:jc w:val="center"/>
               <w:cnfStyle w:val="000000000000" w:firstRow="0" w:lastRow="0" w:firstColumn="0" w:lastColumn="0" w:oddVBand="0" w:evenVBand="0" w:oddHBand="0" w:evenHBand="0" w:firstRowFirstColumn="0" w:firstRowLastColumn="0" w:lastRowFirstColumn="0" w:lastRowLastColumn="0"/>
-              <w:rPr>
-                <w:lang/>
-              </w:rPr>
             </w:pPr>
             <w:r>
-              <w:rPr>
-                <w:lang/>
-              </w:rPr>
               <w:t>/api/chats/{id}/members</w:t>
             </w:r>
           </w:p>
@@ -6183,14 +6223,8 @@
               <w:ind w:firstLine="0"/>
               <w:jc w:val="center"/>
               <w:cnfStyle w:val="000000000000" w:firstRow="0" w:lastRow="0" w:firstColumn="0" w:lastColumn="0" w:oddVBand="0" w:evenVBand="0" w:oddHBand="0" w:evenHBand="0" w:firstRowFirstColumn="0" w:firstRowLastColumn="0" w:lastRowFirstColumn="0" w:lastRowLastColumn="0"/>
-              <w:rPr>
-                <w:lang/>
-              </w:rPr>
             </w:pPr>
             <w:r>
-              <w:rPr>
-                <w:lang/>
-              </w:rPr>
               <w:t>Добавление пользователя в чат</w:t>
             </w:r>
           </w:p>
@@ -6211,14 +6245,12 @@
               <w:rPr>
                 <w:b w:val="0"/>
                 <w:bCs w:val="0"/>
-                <w:lang/>
               </w:rPr>
             </w:pPr>
             <w:r>
               <w:rPr>
                 <w:b w:val="0"/>
                 <w:bCs w:val="0"/>
-                <w:lang/>
               </w:rPr>
               <w:t>DELETE</w:t>
             </w:r>
@@ -6236,14 +6268,52 @@
               <w:jc w:val="center"/>
               <w:cnfStyle w:val="000000000000" w:firstRow="0" w:lastRow="0" w:firstColumn="0" w:lastColumn="0" w:oddVBand="0" w:evenVBand="0" w:oddHBand="0" w:evenHBand="0" w:firstRowFirstColumn="0" w:firstRowLastColumn="0" w:lastRowFirstColumn="0" w:lastRowLastColumn="0"/>
               <w:rPr>
-                <w:lang/>
+                <w:lang w:val="en-US"/>
               </w:rPr>
             </w:pPr>
             <w:r>
               <w:rPr>
-                <w:lang/>
-              </w:rPr>
-              <w:t>/api/chats/{id}/members/{userId}</w:t>
+                <w:lang w:val="en-US"/>
+              </w:rPr>
+              <w:t>/</w:t>
+            </w:r>
+            <w:proofErr w:type="spellStart"/>
+            <w:proofErr w:type="gramStart"/>
+            <w:r>
+              <w:rPr>
+                <w:lang w:val="en-US"/>
+              </w:rPr>
+              <w:t>api</w:t>
+            </w:r>
+            <w:proofErr w:type="spellEnd"/>
+            <w:proofErr w:type="gramEnd"/>
+            <w:r>
+              <w:rPr>
+                <w:lang w:val="en-US"/>
+              </w:rPr>
+              <w:t>/</w:t>
+            </w:r>
+            <w:proofErr w:type="gramStart"/>
+            <w:r>
+              <w:rPr>
+                <w:lang w:val="en-US"/>
+              </w:rPr>
+              <w:t>chats/{id}/members/{</w:t>
+            </w:r>
+            <w:proofErr w:type="spellStart"/>
+            <w:proofErr w:type="gramEnd"/>
+            <w:r>
+              <w:rPr>
+                <w:lang w:val="en-US"/>
+              </w:rPr>
+              <w:t>userId</w:t>
+            </w:r>
+            <w:proofErr w:type="spellEnd"/>
+            <w:r>
+              <w:rPr>
+                <w:lang w:val="en-US"/>
+              </w:rPr>
+              <w:t>}</w:t>
             </w:r>
           </w:p>
         </w:tc>
@@ -6258,14 +6328,8 @@
               <w:ind w:firstLine="0"/>
               <w:jc w:val="center"/>
               <w:cnfStyle w:val="000000000000" w:firstRow="0" w:lastRow="0" w:firstColumn="0" w:lastColumn="0" w:oddVBand="0" w:evenVBand="0" w:oddHBand="0" w:evenHBand="0" w:firstRowFirstColumn="0" w:firstRowLastColumn="0" w:lastRowFirstColumn="0" w:lastRowLastColumn="0"/>
-              <w:rPr>
-                <w:lang/>
-              </w:rPr>
             </w:pPr>
             <w:r>
-              <w:rPr>
-                <w:lang/>
-              </w:rPr>
               <w:t>Удаление пользователя из чата</w:t>
             </w:r>
           </w:p>
@@ -6286,14 +6350,12 @@
               <w:rPr>
                 <w:b w:val="0"/>
                 <w:bCs w:val="0"/>
-                <w:lang/>
               </w:rPr>
             </w:pPr>
             <w:r>
               <w:rPr>
                 <w:b w:val="0"/>
                 <w:bCs w:val="0"/>
-                <w:lang/>
               </w:rPr>
               <w:t>PATCH</w:t>
             </w:r>
@@ -6310,14 +6372,8 @@
               <w:ind w:firstLine="0"/>
               <w:jc w:val="center"/>
               <w:cnfStyle w:val="000000000000" w:firstRow="0" w:lastRow="0" w:firstColumn="0" w:lastColumn="0" w:oddVBand="0" w:evenVBand="0" w:oddHBand="0" w:evenHBand="0" w:firstRowFirstColumn="0" w:firstRowLastColumn="0" w:lastRowFirstColumn="0" w:lastRowLastColumn="0"/>
-              <w:rPr>
-                <w:lang/>
-              </w:rPr>
             </w:pPr>
             <w:r>
-              <w:rPr>
-                <w:lang/>
-              </w:rPr>
               <w:t>/api/chats/{id}/rename</w:t>
             </w:r>
           </w:p>
@@ -6333,14 +6389,8 @@
               <w:ind w:firstLine="0"/>
               <w:jc w:val="center"/>
               <w:cnfStyle w:val="000000000000" w:firstRow="0" w:lastRow="0" w:firstColumn="0" w:lastColumn="0" w:oddVBand="0" w:evenVBand="0" w:oddHBand="0" w:evenHBand="0" w:firstRowFirstColumn="0" w:firstRowLastColumn="0" w:lastRowFirstColumn="0" w:lastRowLastColumn="0"/>
-              <w:rPr>
-                <w:lang/>
-              </w:rPr>
             </w:pPr>
             <w:r>
-              <w:rPr>
-                <w:lang/>
-              </w:rPr>
               <w:t>Переименование чата</w:t>
             </w:r>
           </w:p>
@@ -6361,14 +6411,12 @@
               <w:rPr>
                 <w:b w:val="0"/>
                 <w:bCs w:val="0"/>
-                <w:lang/>
               </w:rPr>
             </w:pPr>
             <w:r>
               <w:rPr>
                 <w:b w:val="0"/>
                 <w:bCs w:val="0"/>
-                <w:lang/>
               </w:rPr>
               <w:t>POST</w:t>
             </w:r>
@@ -6385,14 +6433,8 @@
               <w:ind w:firstLine="0"/>
               <w:jc w:val="center"/>
               <w:cnfStyle w:val="000000000000" w:firstRow="0" w:lastRow="0" w:firstColumn="0" w:lastColumn="0" w:oddVBand="0" w:evenVBand="0" w:oddHBand="0" w:evenHBand="0" w:firstRowFirstColumn="0" w:firstRowLastColumn="0" w:lastRowFirstColumn="0" w:lastRowLastColumn="0"/>
-              <w:rPr>
-                <w:lang/>
-              </w:rPr>
             </w:pPr>
             <w:r>
-              <w:rPr>
-                <w:lang/>
-              </w:rPr>
               <w:t>/api/chats/{id}/read</w:t>
             </w:r>
           </w:p>
@@ -6408,14 +6450,8 @@
               <w:ind w:firstLine="0"/>
               <w:jc w:val="center"/>
               <w:cnfStyle w:val="000000000000" w:firstRow="0" w:lastRow="0" w:firstColumn="0" w:lastColumn="0" w:oddVBand="0" w:evenVBand="0" w:oddHBand="0" w:evenHBand="0" w:firstRowFirstColumn="0" w:firstRowLastColumn="0" w:lastRowFirstColumn="0" w:lastRowLastColumn="0"/>
-              <w:rPr>
-                <w:lang/>
-              </w:rPr>
             </w:pPr>
             <w:r>
-              <w:rPr>
-                <w:lang/>
-              </w:rPr>
               <w:t>Пометка сообщений как прочитанных</w:t>
             </w:r>
           </w:p>
@@ -6436,14 +6472,12 @@
               <w:rPr>
                 <w:b w:val="0"/>
                 <w:bCs w:val="0"/>
-                <w:lang/>
               </w:rPr>
             </w:pPr>
             <w:r>
               <w:rPr>
                 <w:b w:val="0"/>
                 <w:bCs w:val="0"/>
-                <w:lang/>
               </w:rPr>
               <w:t>GET</w:t>
             </w:r>
@@ -6460,14 +6494,8 @@
               <w:ind w:firstLine="0"/>
               <w:jc w:val="center"/>
               <w:cnfStyle w:val="000000000000" w:firstRow="0" w:lastRow="0" w:firstColumn="0" w:lastColumn="0" w:oddVBand="0" w:evenVBand="0" w:oddHBand="0" w:evenHBand="0" w:firstRowFirstColumn="0" w:firstRowLastColumn="0" w:lastRowFirstColumn="0" w:lastRowLastColumn="0"/>
-              <w:rPr>
-                <w:lang/>
-              </w:rPr>
             </w:pPr>
             <w:r>
-              <w:rPr>
-                <w:lang/>
-              </w:rPr>
               <w:t>/api/chats/{id}/pinned</w:t>
             </w:r>
           </w:p>
@@ -6483,14 +6511,8 @@
               <w:ind w:firstLine="0"/>
               <w:jc w:val="center"/>
               <w:cnfStyle w:val="000000000000" w:firstRow="0" w:lastRow="0" w:firstColumn="0" w:lastColumn="0" w:oddVBand="0" w:evenVBand="0" w:oddHBand="0" w:evenHBand="0" w:firstRowFirstColumn="0" w:firstRowLastColumn="0" w:lastRowFirstColumn="0" w:lastRowLastColumn="0"/>
-              <w:rPr>
-                <w:lang/>
-              </w:rPr>
             </w:pPr>
             <w:r>
-              <w:rPr>
-                <w:lang/>
-              </w:rPr>
               <w:t>Получение закреплённых сообщений</w:t>
             </w:r>
           </w:p>
@@ -6511,14 +6533,12 @@
               <w:rPr>
                 <w:b w:val="0"/>
                 <w:bCs w:val="0"/>
-                <w:lang/>
               </w:rPr>
             </w:pPr>
             <w:r>
               <w:rPr>
                 <w:b w:val="0"/>
                 <w:bCs w:val="0"/>
-                <w:lang/>
               </w:rPr>
               <w:t>GET</w:t>
             </w:r>
@@ -6535,14 +6555,8 @@
               <w:ind w:firstLine="0"/>
               <w:jc w:val="center"/>
               <w:cnfStyle w:val="000000000000" w:firstRow="0" w:lastRow="0" w:firstColumn="0" w:lastColumn="0" w:oddVBand="0" w:evenVBand="0" w:oddHBand="0" w:evenHBand="0" w:firstRowFirstColumn="0" w:firstRowLastColumn="0" w:lastRowFirstColumn="0" w:lastRowLastColumn="0"/>
-              <w:rPr>
-                <w:lang/>
-              </w:rPr>
             </w:pPr>
             <w:r>
-              <w:rPr>
-                <w:lang/>
-              </w:rPr>
               <w:t>/api/messages/{chatId}</w:t>
             </w:r>
           </w:p>
@@ -6558,14 +6572,8 @@
               <w:ind w:firstLine="0"/>
               <w:jc w:val="center"/>
               <w:cnfStyle w:val="000000000000" w:firstRow="0" w:lastRow="0" w:firstColumn="0" w:lastColumn="0" w:oddVBand="0" w:evenVBand="0" w:oddHBand="0" w:evenHBand="0" w:firstRowFirstColumn="0" w:firstRowLastColumn="0" w:lastRowFirstColumn="0" w:lastRowLastColumn="0"/>
-              <w:rPr>
-                <w:lang/>
-              </w:rPr>
             </w:pPr>
             <w:r>
-              <w:rPr>
-                <w:lang/>
-              </w:rPr>
               <w:t>Получение истории сообщений</w:t>
             </w:r>
           </w:p>
@@ -6586,14 +6594,12 @@
               <w:rPr>
                 <w:b w:val="0"/>
                 <w:bCs w:val="0"/>
-                <w:lang/>
               </w:rPr>
             </w:pPr>
             <w:r>
               <w:rPr>
                 <w:b w:val="0"/>
                 <w:bCs w:val="0"/>
-                <w:lang/>
               </w:rPr>
               <w:t>POST</w:t>
             </w:r>
@@ -6610,14 +6616,8 @@
               <w:ind w:firstLine="0"/>
               <w:jc w:val="center"/>
               <w:cnfStyle w:val="000000000000" w:firstRow="0" w:lastRow="0" w:firstColumn="0" w:lastColumn="0" w:oddVBand="0" w:evenVBand="0" w:oddHBand="0" w:evenHBand="0" w:firstRowFirstColumn="0" w:firstRowLastColumn="0" w:lastRowFirstColumn="0" w:lastRowLastColumn="0"/>
-              <w:rPr>
-                <w:lang/>
-              </w:rPr>
             </w:pPr>
             <w:r>
-              <w:rPr>
-                <w:lang/>
-              </w:rPr>
               <w:t>/api/messages</w:t>
             </w:r>
           </w:p>
@@ -6633,14 +6633,8 @@
               <w:ind w:firstLine="0"/>
               <w:jc w:val="center"/>
               <w:cnfStyle w:val="000000000000" w:firstRow="0" w:lastRow="0" w:firstColumn="0" w:lastColumn="0" w:oddVBand="0" w:evenVBand="0" w:oddHBand="0" w:evenHBand="0" w:firstRowFirstColumn="0" w:firstRowLastColumn="0" w:lastRowFirstColumn="0" w:lastRowLastColumn="0"/>
-              <w:rPr>
-                <w:lang/>
-              </w:rPr>
             </w:pPr>
             <w:r>
-              <w:rPr>
-                <w:lang/>
-              </w:rPr>
               <w:t>Отправка текстового сообщения</w:t>
             </w:r>
           </w:p>
@@ -6661,39 +6655,14 @@
               <w:rPr>
                 <w:b w:val="0"/>
                 <w:bCs w:val="0"/>
-                <w:lang/>
               </w:rPr>
             </w:pPr>
             <w:r>
               <w:rPr>
                 <w:b w:val="0"/>
                 <w:bCs w:val="0"/>
-                <w:lang/>
               </w:rPr>
               <w:t>POST</w:t>
-            </w:r>
-          </w:p>
-        </w:tc>
-        <w:tc>
-          <w:tcPr>
-            <w:tcW w:w="0" w:type="auto"/>
-            <w:vAlign w:val="center"/>
-            <w:hideMark/>
-          </w:tcPr>
-          <w:p>
-            <w:pPr>
-              <w:ind w:firstLine="0"/>
-              <w:jc w:val="center"/>
-              <w:cnfStyle w:val="000000000000" w:firstRow="0" w:lastRow="0" w:firstColumn="0" w:lastColumn="0" w:oddVBand="0" w:evenVBand="0" w:oddHBand="0" w:evenHBand="0" w:firstRowFirstColumn="0" w:firstRowLastColumn="0" w:lastRowFirstColumn="0" w:lastRowLastColumn="0"/>
-              <w:rPr>
-                <w:lang/>
-              </w:rPr>
-            </w:pPr>
-            <w:r>
-              <w:rPr>
-                <w:lang/>
-              </w:rPr>
-              <w:t>/api/messages/file</w:t>
             </w:r>
           </w:p>
         </w:tc>
@@ -6710,9 +6679,23 @@
               <w:cnfStyle w:val="000000000000" w:firstRow="0" w:lastRow="0" w:firstColumn="0" w:lastColumn="0" w:oddVBand="0" w:evenVBand="0" w:oddHBand="0" w:evenHBand="0" w:firstRowFirstColumn="0" w:firstRowLastColumn="0" w:lastRowFirstColumn="0" w:lastRowLastColumn="0"/>
             </w:pPr>
             <w:r>
-              <w:rPr>
-                <w:lang/>
-              </w:rPr>
+              <w:t>/api/messages/file</w:t>
+            </w:r>
+          </w:p>
+        </w:tc>
+        <w:tc>
+          <w:tcPr>
+            <w:tcW w:w="0" w:type="auto"/>
+            <w:vAlign w:val="center"/>
+            <w:hideMark/>
+          </w:tcPr>
+          <w:p>
+            <w:pPr>
+              <w:ind w:firstLine="0"/>
+              <w:jc w:val="center"/>
+              <w:cnfStyle w:val="000000000000" w:firstRow="0" w:lastRow="0" w:firstColumn="0" w:lastColumn="0" w:oddVBand="0" w:evenVBand="0" w:oddHBand="0" w:evenHBand="0" w:firstRowFirstColumn="0" w:firstRowLastColumn="0" w:lastRowFirstColumn="0" w:lastRowLastColumn="0"/>
+            </w:pPr>
+            <w:r>
               <w:t>Отправка файла</w:t>
             </w:r>
           </w:p>
@@ -6733,14 +6716,12 @@
               <w:rPr>
                 <w:b w:val="0"/>
                 <w:bCs w:val="0"/>
-                <w:lang/>
               </w:rPr>
             </w:pPr>
             <w:r>
               <w:rPr>
                 <w:b w:val="0"/>
                 <w:bCs w:val="0"/>
-                <w:lang/>
               </w:rPr>
               <w:t>PUT</w:t>
             </w:r>
@@ -6757,14 +6738,8 @@
               <w:ind w:firstLine="0"/>
               <w:jc w:val="center"/>
               <w:cnfStyle w:val="000000000000" w:firstRow="0" w:lastRow="0" w:firstColumn="0" w:lastColumn="0" w:oddVBand="0" w:evenVBand="0" w:oddHBand="0" w:evenHBand="0" w:firstRowFirstColumn="0" w:firstRowLastColumn="0" w:lastRowFirstColumn="0" w:lastRowLastColumn="0"/>
-              <w:rPr>
-                <w:lang/>
-              </w:rPr>
             </w:pPr>
             <w:r>
-              <w:rPr>
-                <w:lang/>
-              </w:rPr>
               <w:t>/api/messages/{id}</w:t>
             </w:r>
           </w:p>
@@ -6780,14 +6755,8 @@
               <w:ind w:firstLine="0"/>
               <w:jc w:val="center"/>
               <w:cnfStyle w:val="000000000000" w:firstRow="0" w:lastRow="0" w:firstColumn="0" w:lastColumn="0" w:oddVBand="0" w:evenVBand="0" w:oddHBand="0" w:evenHBand="0" w:firstRowFirstColumn="0" w:firstRowLastColumn="0" w:lastRowFirstColumn="0" w:lastRowLastColumn="0"/>
-              <w:rPr>
-                <w:lang/>
-              </w:rPr>
             </w:pPr>
             <w:r>
-              <w:rPr>
-                <w:lang/>
-              </w:rPr>
               <w:t>Редактирование сообщения</w:t>
             </w:r>
           </w:p>
@@ -6808,14 +6777,12 @@
               <w:rPr>
                 <w:b w:val="0"/>
                 <w:bCs w:val="0"/>
-                <w:lang/>
               </w:rPr>
             </w:pPr>
             <w:r>
               <w:rPr>
                 <w:b w:val="0"/>
                 <w:bCs w:val="0"/>
-                <w:lang/>
               </w:rPr>
               <w:t>DELETE</w:t>
             </w:r>
@@ -6832,14 +6799,8 @@
               <w:ind w:firstLine="0"/>
               <w:jc w:val="center"/>
               <w:cnfStyle w:val="000000000000" w:firstRow="0" w:lastRow="0" w:firstColumn="0" w:lastColumn="0" w:oddVBand="0" w:evenVBand="0" w:oddHBand="0" w:evenHBand="0" w:firstRowFirstColumn="0" w:firstRowLastColumn="0" w:lastRowFirstColumn="0" w:lastRowLastColumn="0"/>
-              <w:rPr>
-                <w:lang/>
-              </w:rPr>
             </w:pPr>
             <w:r>
-              <w:rPr>
-                <w:lang/>
-              </w:rPr>
               <w:t>/api/messages/{id}</w:t>
             </w:r>
           </w:p>
@@ -6855,14 +6816,8 @@
               <w:ind w:firstLine="0"/>
               <w:jc w:val="center"/>
               <w:cnfStyle w:val="000000000000" w:firstRow="0" w:lastRow="0" w:firstColumn="0" w:lastColumn="0" w:oddVBand="0" w:evenVBand="0" w:oddHBand="0" w:evenHBand="0" w:firstRowFirstColumn="0" w:firstRowLastColumn="0" w:lastRowFirstColumn="0" w:lastRowLastColumn="0"/>
-              <w:rPr>
-                <w:lang/>
-              </w:rPr>
             </w:pPr>
             <w:r>
-              <w:rPr>
-                <w:lang/>
-              </w:rPr>
               <w:t>Удаление сообщения</w:t>
             </w:r>
           </w:p>
@@ -6883,14 +6838,12 @@
               <w:rPr>
                 <w:b w:val="0"/>
                 <w:bCs w:val="0"/>
-                <w:lang/>
               </w:rPr>
             </w:pPr>
             <w:r>
               <w:rPr>
                 <w:b w:val="0"/>
                 <w:bCs w:val="0"/>
-                <w:lang/>
               </w:rPr>
               <w:t>PATCH</w:t>
             </w:r>
@@ -6907,14 +6860,8 @@
               <w:ind w:firstLine="0"/>
               <w:jc w:val="center"/>
               <w:cnfStyle w:val="000000000000" w:firstRow="0" w:lastRow="0" w:firstColumn="0" w:lastColumn="0" w:oddVBand="0" w:evenVBand="0" w:oddHBand="0" w:evenHBand="0" w:firstRowFirstColumn="0" w:firstRowLastColumn="0" w:lastRowFirstColumn="0" w:lastRowLastColumn="0"/>
-              <w:rPr>
-                <w:lang/>
-              </w:rPr>
             </w:pPr>
             <w:r>
-              <w:rPr>
-                <w:lang/>
-              </w:rPr>
               <w:t>/api/messages/{id}/pin</w:t>
             </w:r>
           </w:p>
@@ -6930,14 +6877,8 @@
               <w:ind w:firstLine="0"/>
               <w:jc w:val="center"/>
               <w:cnfStyle w:val="000000000000" w:firstRow="0" w:lastRow="0" w:firstColumn="0" w:lastColumn="0" w:oddVBand="0" w:evenVBand="0" w:oddHBand="0" w:evenHBand="0" w:firstRowFirstColumn="0" w:firstRowLastColumn="0" w:lastRowFirstColumn="0" w:lastRowLastColumn="0"/>
-              <w:rPr>
-                <w:lang/>
-              </w:rPr>
             </w:pPr>
             <w:r>
-              <w:rPr>
-                <w:lang/>
-              </w:rPr>
               <w:t>Закрепление сообщения</w:t>
             </w:r>
           </w:p>
@@ -6958,14 +6899,12 @@
               <w:rPr>
                 <w:b w:val="0"/>
                 <w:bCs w:val="0"/>
-                <w:lang/>
               </w:rPr>
             </w:pPr>
             <w:r>
               <w:rPr>
                 <w:b w:val="0"/>
                 <w:bCs w:val="0"/>
-                <w:lang/>
               </w:rPr>
               <w:t>PATCH</w:t>
             </w:r>
@@ -6982,14 +6921,8 @@
               <w:ind w:firstLine="0"/>
               <w:jc w:val="center"/>
               <w:cnfStyle w:val="000000000000" w:firstRow="0" w:lastRow="0" w:firstColumn="0" w:lastColumn="0" w:oddVBand="0" w:evenVBand="0" w:oddHBand="0" w:evenHBand="0" w:firstRowFirstColumn="0" w:firstRowLastColumn="0" w:lastRowFirstColumn="0" w:lastRowLastColumn="0"/>
-              <w:rPr>
-                <w:lang/>
-              </w:rPr>
             </w:pPr>
             <w:r>
-              <w:rPr>
-                <w:lang/>
-              </w:rPr>
               <w:t>/api/messages/{id}/unpin</w:t>
             </w:r>
           </w:p>
@@ -7005,14 +6938,8 @@
               <w:ind w:firstLine="0"/>
               <w:jc w:val="center"/>
               <w:cnfStyle w:val="000000000000" w:firstRow="0" w:lastRow="0" w:firstColumn="0" w:lastColumn="0" w:oddVBand="0" w:evenVBand="0" w:oddHBand="0" w:evenHBand="0" w:firstRowFirstColumn="0" w:firstRowLastColumn="0" w:lastRowFirstColumn="0" w:lastRowLastColumn="0"/>
-              <w:rPr>
-                <w:lang/>
-              </w:rPr>
             </w:pPr>
             <w:r>
-              <w:rPr>
-                <w:lang/>
-              </w:rPr>
               <w:t>Открепление сообщения</w:t>
             </w:r>
           </w:p>
@@ -7033,14 +6960,12 @@
               <w:rPr>
                 <w:b w:val="0"/>
                 <w:bCs w:val="0"/>
-                <w:lang/>
               </w:rPr>
             </w:pPr>
             <w:r>
               <w:rPr>
                 <w:b w:val="0"/>
                 <w:bCs w:val="0"/>
-                <w:lang/>
               </w:rPr>
               <w:t>GET</w:t>
             </w:r>
@@ -7057,14 +6982,8 @@
               <w:ind w:firstLine="0"/>
               <w:jc w:val="center"/>
               <w:cnfStyle w:val="000000000000" w:firstRow="0" w:lastRow="0" w:firstColumn="0" w:lastColumn="0" w:oddVBand="0" w:evenVBand="0" w:oddHBand="0" w:evenHBand="0" w:firstRowFirstColumn="0" w:firstRowLastColumn="0" w:lastRowFirstColumn="0" w:lastRowLastColumn="0"/>
-              <w:rPr>
-                <w:lang/>
-              </w:rPr>
             </w:pPr>
             <w:r>
-              <w:rPr>
-                <w:lang/>
-              </w:rPr>
               <w:t>/api/messages/{chatId}/search</w:t>
             </w:r>
           </w:p>
@@ -7080,14 +6999,8 @@
               <w:ind w:firstLine="0"/>
               <w:jc w:val="center"/>
               <w:cnfStyle w:val="000000000000" w:firstRow="0" w:lastRow="0" w:firstColumn="0" w:lastColumn="0" w:oddVBand="0" w:evenVBand="0" w:oddHBand="0" w:evenHBand="0" w:firstRowFirstColumn="0" w:firstRowLastColumn="0" w:lastRowFirstColumn="0" w:lastRowLastColumn="0"/>
-              <w:rPr>
-                <w:lang/>
-              </w:rPr>
             </w:pPr>
             <w:r>
-              <w:rPr>
-                <w:lang/>
-              </w:rPr>
               <w:t>Поиск сообщений в чате</w:t>
             </w:r>
           </w:p>
@@ -7161,7 +7074,6 @@
           <w:b/>
           <w:bCs/>
           <w:color w:val="000000" w:themeColor="text1"/>
-          <w:lang/>
         </w:rPr>
       </w:pPr>
       <w:bookmarkStart w:id="18" w:name="_Toc228216027"/>
@@ -7171,29 +7083,9 @@
           <w:b/>
           <w:bCs/>
           <w:color w:val="000000" w:themeColor="text1"/>
-          <w:lang/>
         </w:rPr>
         <w:lastRenderedPageBreak/>
-        <w:t>3.2.</w:t>
-      </w:r>
-      <w:r>
-        <w:rPr>
-          <w:rFonts w:ascii="Times New Roman" w:hAnsi="Times New Roman" w:cs="Times New Roman"/>
-          <w:b/>
-          <w:bCs/>
-          <w:color w:val="000000" w:themeColor="text1"/>
-        </w:rPr>
-        <w:t>4</w:t>
-      </w:r>
-      <w:r>
-        <w:rPr>
-          <w:rFonts w:ascii="Times New Roman" w:hAnsi="Times New Roman" w:cs="Times New Roman"/>
-          <w:b/>
-          <w:bCs/>
-          <w:color w:val="000000" w:themeColor="text1"/>
-          <w:lang/>
-        </w:rPr>
-        <w:t xml:space="preserve"> Модель базы данных</w:t>
+        <w:t>3.2.4 Модель базы данных</w:t>
       </w:r>
       <w:bookmarkEnd w:id="18"/>
     </w:p>
@@ -7291,10 +7183,7 @@
         <w:t>-</w:t>
       </w:r>
       <w:r>
-        <w:t xml:space="preserve">диаграмма </w:t>
-      </w:r>
-      <w:r>
-        <w:t>базы данных</w:t>
+        <w:t>диаграмма базы данных</w:t>
       </w:r>
     </w:p>
     <w:p>
@@ -7304,15 +7193,9 @@
     </w:p>
     <w:p>
       <w:r>
-        <w:rPr>
-          <w:lang/>
-        </w:rPr>
         <w:t xml:space="preserve">Центральным элементом архитектуры данных является нормализованная структура связей, где взаимодействие между пользователями и чатами реализуется через промежуточную сущность </w:t>
       </w:r>
       <w:r>
-        <w:rPr>
-          <w:lang/>
-        </w:rPr>
         <w:lastRenderedPageBreak/>
         <w:t>участников. Это позволяет не только гибко управлять доступом к переписке, но и отслеживать специфические состояния для каждого пользователя</w:t>
       </w:r>
@@ -7322,9 +7205,6 @@
     </w:p>
     <w:p>
       <w:r>
-        <w:rPr>
-          <w:lang/>
-        </w:rPr>
         <w:t>Модель сообщений спроектирована с учетом поддержки мультимедийного контента и древовидных обсуждений. Использование рекурсивной связи внутри таблицы сообщений позволяет организовать систему ответов, где каждое сообщение может ссылаться на родительский объект. При этом связи с сущностями отправителя и чата обеспечивают быструю выборку истории переписки с сохранением авторства</w:t>
       </w:r>
     </w:p>
@@ -7351,7 +7231,6 @@
           <w:color w:val="000000" w:themeColor="text1"/>
           <w:sz w:val="28"/>
           <w:szCs w:val="28"/>
-          <w:lang/>
         </w:rPr>
         <w:t>3.3 Реализация клиентской части</w:t>
       </w:r>
@@ -7376,7 +7255,6 @@
           <w:b/>
           <w:bCs/>
           <w:color w:val="000000" w:themeColor="text1"/>
-          <w:lang/>
         </w:rPr>
         <w:t>3.3.1 Общая структура фронтенда</w:t>
       </w:r>
@@ -7388,10 +7266,29 @@
         <w:spacing w:line="360" w:lineRule="exact"/>
       </w:pPr>
       <w:r>
-        <w:rPr>
-          <w:lang/>
-        </w:rPr>
-        <w:t xml:space="preserve">Клиентская часть мессенджера реализована как одностраничное веб-приложение (SPA) на базе библиотеки React с использованием TypeScript. Использование строгой типизации на фронтенде позволяет синхронизировать структуры данных с серверной частью, что значительно снижает количество ошибок при обработке ответов от API. </w:t>
+        <w:t xml:space="preserve">Клиентская часть мессенджера реализована как одностраничное веб-приложение (SPA) на базе библиотеки </w:t>
+      </w:r>
+      <w:proofErr w:type="spellStart"/>
+      <w:r>
+        <w:t>React</w:t>
+      </w:r>
+      <w:proofErr w:type="spellEnd"/>
+      <w:r>
+        <w:t xml:space="preserve"> </w:t>
+      </w:r>
+      <w:r>
+        <w:t>[9]</w:t>
+      </w:r>
+      <w:r>
+        <w:t xml:space="preserve"> с использованием </w:t>
+      </w:r>
+      <w:proofErr w:type="spellStart"/>
+      <w:r>
+        <w:t>TypeScript</w:t>
+      </w:r>
+      <w:proofErr w:type="spellEnd"/>
+      <w:r>
+        <w:t xml:space="preserve">. Использование строгой типизации на фронтенде позволяет синхронизировать структуры данных с серверной частью, что значительно снижает количество ошибок при обработке ответов от API. </w:t>
       </w:r>
     </w:p>
     <w:p/>
@@ -7403,6 +7300,9 @@
         </w:rPr>
       </w:pPr>
       <w:r>
+        <w:rPr>
+          <w:noProof/>
+        </w:rPr>
         <w:drawing>
           <wp:inline distT="0" distB="0" distL="0" distR="0" wp14:anchorId="076B2AC0" wp14:editId="3553BD66">
             <wp:extent cx="1610470" cy="3600000"/>
@@ -7477,20 +7377,11 @@
     <w:p>
       <w:pPr>
         <w:spacing w:line="360" w:lineRule="exact"/>
-        <w:rPr>
-          <w:lang/>
-        </w:rPr>
-      </w:pPr>
-      <w:r>
-        <w:rPr>
-          <w:lang/>
-        </w:rPr>
+      </w:pPr>
+      <w:r>
         <w:t xml:space="preserve">Централизованное управление данными в приложении реализовано с </w:t>
       </w:r>
       <w:r>
-        <w:rPr>
-          <w:lang/>
-        </w:rPr>
         <w:lastRenderedPageBreak/>
         <w:t>помощью библиотеки Zustand. Это решение позволило создать легковесные и производительные хранилища для управления авторизацией пользователя и состоянием активных чатов, обеспечивая мгновенную реакцию интерфейса на изменения данных без избыточных перерисовок компонентов. Для стилизации интерфейса применен фреймворк Tailwind CSS, который обеспечивает адаптивность мессенджера под различные разрешения экранов и консистентность визуального оформления.</w:t>
       </w:r>
@@ -7501,15 +7392,23 @@
     <w:p>
       <w:pPr>
         <w:spacing w:line="360" w:lineRule="exact"/>
-        <w:rPr>
-          <w:lang/>
-        </w:rPr>
-      </w:pPr>
-      <w:r>
-        <w:rPr>
-          <w:lang/>
-        </w:rPr>
-        <w:t>Взаимодействие с серверной частью организовано через два дополняющих друг друга механизма. Основной обмен данными, такой как авторизация, получение истории сообщений и загрузка файлов, осуществляется посредством асинхронных HTTP-запросов с использованием библиотеки Axios. Для обеспечения безопасности в каждый запрос автоматически внедряется JWT-токен через механизмы перехватчиков (interceptors). В свою очередь, для реализации функций реального времени используется клиент SignalR. Он поддерживает постоянное соединение с сервером, позволяя мгновенно отображать входящие сообщения, уведомления о наборе текста и статусы прочтения без необходимости повторного опроса сервера клиентом. Такой гибридный подход обеспечивает высокую отзывчивость системы и соответствует стандартам современных корпоративных инструментов связи.</w:t>
+      </w:pPr>
+      <w:r>
+        <w:t xml:space="preserve">Взаимодействие с серверной частью организовано через два дополняющих друг друга механизма. Основной обмен данными, такой как авторизация, получение истории сообщений и загрузка файлов, осуществляется посредством асинхронных HTTP-запросов с использованием библиотеки Axios. Для обеспечения безопасности в каждый запрос автоматически внедряется JWT-токен через механизмы перехватчиков (interceptors). В свою очередь, для реализации функций реального времени используется клиент </w:t>
+      </w:r>
+      <w:proofErr w:type="spellStart"/>
+      <w:r>
+        <w:t>SignalR</w:t>
+      </w:r>
+      <w:proofErr w:type="spellEnd"/>
+      <w:r>
+        <w:t xml:space="preserve"> </w:t>
+      </w:r>
+      <w:r>
+        <w:t>[3]</w:t>
+      </w:r>
+      <w:r>
+        <w:t>. Он поддерживает постоянное соединение с сервером, позволяя мгновенно отображать входящие сообщения, уведомления о наборе текста и статусы прочтения без необходимости повторного опроса сервера клиентом. Такой гибридный подход обеспечивает высокую отзывчивость системы и соответствует стандартам современных корпоративных инструментов связи.</w:t>
       </w:r>
     </w:p>
     <w:p>
@@ -7526,7 +7425,6 @@
           <w:b/>
           <w:bCs/>
           <w:color w:val="000000" w:themeColor="text1"/>
-          <w:lang/>
         </w:rPr>
       </w:pPr>
       <w:bookmarkStart w:id="21" w:name="_Toc228216030"/>
@@ -7555,45 +7453,21 @@
           <w:bCs/>
           <w:color w:val="000000" w:themeColor="text1"/>
         </w:rPr>
-        <w:t xml:space="preserve">.2 </w:t>
-      </w:r>
-      <w:r>
-        <w:rPr>
-          <w:rFonts w:ascii="Times New Roman" w:hAnsi="Times New Roman" w:cs="Times New Roman"/>
-          <w:b/>
-          <w:bCs/>
-          <w:color w:val="000000" w:themeColor="text1"/>
-          <w:lang/>
-        </w:rPr>
-        <w:t>Пользовательский интерфейс</w:t>
+        <w:t>.2 Пользовательский интерфейс</w:t>
       </w:r>
       <w:bookmarkEnd w:id="21"/>
     </w:p>
     <w:p/>
     <w:p>
-      <w:pPr>
-        <w:rPr>
-          <w:lang/>
-        </w:rPr>
-      </w:pPr>
-      <w:r>
-        <w:rPr>
-          <w:lang/>
-        </w:rPr>
+      <w:r>
         <w:t>Процесс взаимодействия с программным комплексом начинается с этапа идентификации и аутентификации пользователя. Для обеспечения доступа к функциям мессенджера реализованы интуитивно понятные формы входа и создания новой учетной записи. При первом посещении приложения пользователю предлагается пройти процедуру регистрации, в ходе которой осуществляется сбор необходимых данных: полного имени, уникального псевдонима (username) и адреса электронной почты. На данном этапе внедрены механизмы предварительной валидации, предотвращающие отправку пустых полей или некорректных адресов, что снижает нагрузку на серверную часть и ускоряет процесс регистрации.</w:t>
       </w:r>
     </w:p>
     <w:p>
       <w:r>
-        <w:rPr>
-          <w:lang/>
-        </w:rPr>
         <w:t xml:space="preserve">После создания учетной записи или при повторном входе в систему пользователь перенаправляется на форму аутентификации. Взаимодействие с данной формой инициирует процесс обмена данными с сервером для получения JWT-токена, который в дальнейшем используется для авторизации всех последующих запросов. Интерфейс этих страниц спроектирован таким образом, чтобы минимизировать когнитивную нагрузку, предлагая </w:t>
       </w:r>
       <w:r>
-        <w:rPr>
-          <w:lang/>
-        </w:rPr>
         <w:lastRenderedPageBreak/>
         <w:t xml:space="preserve">пользователю сфокусироваться на вводе учетных данных в центре экрана. </w:t>
       </w:r>
@@ -7605,6 +7479,9 @@
         <w:jc w:val="center"/>
       </w:pPr>
       <w:r>
+        <w:rPr>
+          <w:noProof/>
+        </w:rPr>
         <w:drawing>
           <wp:inline distT="0" distB="0" distL="0" distR="0" wp14:anchorId="6895CDFD" wp14:editId="560C5E3E">
             <wp:extent cx="4937760" cy="3517396"/>
@@ -7675,6 +7552,9 @@
         <w:jc w:val="center"/>
       </w:pPr>
       <w:r>
+        <w:rPr>
+          <w:noProof/>
+        </w:rPr>
         <w:drawing>
           <wp:inline distT="0" distB="0" distL="0" distR="0" wp14:anchorId="3388499D" wp14:editId="0E7CE4C1">
             <wp:extent cx="4691679" cy="3498574"/>
@@ -7748,14 +7628,8 @@
     <w:p>
       <w:pPr>
         <w:spacing w:line="360" w:lineRule="exact"/>
-        <w:rPr>
-          <w:lang/>
-        </w:rPr>
-      </w:pPr>
-      <w:r>
-        <w:rPr>
-          <w:lang/>
-        </w:rPr>
+      </w:pPr>
+      <w:r>
         <w:lastRenderedPageBreak/>
         <w:t>После успешной аутентификации пользователь попадает в основное рабочее пространство приложения. Интерфейс главной страницы разделен на две функциональные зоны: боковую панель (Sidebar) для управления списком диалогов и основную область чата (ChatWindow). Такое разделение позволяет сохранять контекст общения, обеспечивая при этом быстрый доступ к навигации.</w:t>
       </w:r>
@@ -7766,42 +7640,30 @@
     <w:p>
       <w:pPr>
         <w:spacing w:line="360" w:lineRule="exact"/>
-        <w:rPr>
-          <w:lang/>
-        </w:rPr>
-      </w:pPr>
-      <w:r>
-        <w:rPr>
-          <w:lang/>
-        </w:rPr>
+      </w:pPr>
+      <w:r>
         <w:t>Боковая панель включает в себя инструменты для глобального поиска пользователей и фильтрации активных диалогов по категориям (личные сообщения, группы). Для удобства администрирования здесь же расположены кнопки быстрого создания новых чатов и перехода к настройкам профиля. Список чатов динамически обновляется: для каждого элемента отображается аватар собеседника, заголовок, последнее сообщение и индикация непрочитанных уведомлений.</w:t>
       </w:r>
     </w:p>
     <w:p>
       <w:pPr>
         <w:ind w:firstLine="0"/>
-        <w:rPr>
-          <w:lang/>
-        </w:rPr>
       </w:pPr>
     </w:p>
     <w:p>
       <w:pPr>
         <w:ind w:firstLine="0"/>
         <w:jc w:val="center"/>
-        <w:rPr>
-          <w:lang w:val="en-US"/>
-        </w:rPr>
-      </w:pPr>
-      <w:r>
-        <w:rPr>
-          <w:lang w:val="en-US"/>
+      </w:pPr>
+      <w:r>
+        <w:rPr>
+          <w:noProof/>
         </w:rPr>
         <w:drawing>
-          <wp:inline distT="0" distB="0" distL="0" distR="0" wp14:anchorId="12E88DD3" wp14:editId="765EF3B7">
-            <wp:extent cx="2671200" cy="3903644"/>
-            <wp:effectExtent l="0" t="0" r="0" b="1905"/>
-            <wp:docPr id="698208079" name="Рисунок 1"/>
+          <wp:inline distT="0" distB="0" distL="0" distR="0" wp14:anchorId="27FEB5A0" wp14:editId="38F5614A">
+            <wp:extent cx="2163170" cy="4437589"/>
+            <wp:effectExtent l="0" t="0" r="8890" b="1270"/>
+            <wp:docPr id="1210555932" name="Рисунок 1"/>
             <wp:cNvGraphicFramePr>
               <a:graphicFrameLocks xmlns:a="http://schemas.openxmlformats.org/drawingml/2006/main" noChangeAspect="1"/>
             </wp:cNvGraphicFramePr>
@@ -7809,7 +7671,7 @@
               <a:graphicData uri="http://schemas.openxmlformats.org/drawingml/2006/picture">
                 <pic:pic xmlns:pic="http://schemas.openxmlformats.org/drawingml/2006/picture">
                   <pic:nvPicPr>
-                    <pic:cNvPr id="698208079" name=""/>
+                    <pic:cNvPr id="1210555932" name=""/>
                     <pic:cNvPicPr/>
                   </pic:nvPicPr>
                   <pic:blipFill>
@@ -7821,7 +7683,7 @@
                   <pic:spPr>
                     <a:xfrm>
                       <a:off x="0" y="0"/>
-                      <a:ext cx="2671200" cy="3903644"/>
+                      <a:ext cx="2166759" cy="4444951"/>
                     </a:xfrm>
                     <a:prstGeom prst="rect">
                       <a:avLst/>
@@ -7837,9 +7699,6 @@
     <w:p>
       <w:pPr>
         <w:ind w:firstLine="0"/>
-        <w:rPr>
-          <w:lang w:val="en-US"/>
-        </w:rPr>
       </w:pPr>
     </w:p>
     <w:p>
@@ -7853,9 +7712,6 @@
         <w:t>1</w:t>
       </w:r>
       <w:r>
-        <w:rPr>
-          <w:lang w:val="en-US"/>
-        </w:rPr>
         <w:t>1</w:t>
       </w:r>
       <w:r>
@@ -7874,35 +7730,20 @@
     <w:p>
       <w:pPr>
         <w:spacing w:line="360" w:lineRule="exact"/>
-        <w:rPr>
-          <w:lang/>
-        </w:rPr>
-      </w:pPr>
-      <w:r>
-        <w:rPr>
-          <w:lang/>
-        </w:rPr>
-        <w:t xml:space="preserve">Центральную часть интерфейса занимает окно активного диалога. В верхней части окна (Header) отображается текущий статус собеседника и инструменты управления конкретным чатом, включая поиск по истории сообщений и панель детальной информации. Одной из ключевых особенностей интерфейса является закрепленная область для важных </w:t>
-      </w:r>
-      <w:r>
-        <w:rPr>
-          <w:lang/>
-        </w:rPr>
+      </w:pPr>
+      <w:r>
+        <w:t xml:space="preserve">Центральную часть интерфейса занимает окно активного диалога. В верхней части окна (Header) отображается текущий статус собеседника и инструменты управления конкретным чатом, включая поиск по истории </w:t>
+      </w:r>
+      <w:r>
         <w:lastRenderedPageBreak/>
-        <w:t>сообщений (Pinned Messages), расположенная непосредственно под заголовком чата.</w:t>
-      </w:r>
-    </w:p>
-    <w:p>
-      <w:pPr>
-        <w:spacing w:line="360" w:lineRule="exact"/>
-        <w:rPr>
-          <w:lang/>
-        </w:rPr>
-      </w:pPr>
-      <w:r>
-        <w:rPr>
-          <w:lang/>
-        </w:rPr>
+        <w:t>сообщений и панель детальной информации. Одной из ключевых особенностей интерфейса является закрепленная область для важных сообщений (Pinned Messages), расположенная непосредственно под заголовком чата.</w:t>
+      </w:r>
+    </w:p>
+    <w:p>
+      <w:pPr>
+        <w:spacing w:line="360" w:lineRule="exact"/>
+      </w:pPr>
+      <w:r>
         <w:t>Основная область сообщений поддерживает бесконечную прокрутку с автоматической подгрузкой истории. Сообщения визуально разделены на входящие и исходящие, снабжены временными метками и индикаторами редактирования. Нижняя часть окна содержит поле ввода с поддержкой многострочного текста. В случае отсутствия прав на отправку сообщений (например, в информационных каналах) поле ввода автоматически заменяется на соответствующее уведомление, информирующее пользователя об ограничениях.</w:t>
       </w:r>
     </w:p>
@@ -7910,9 +7751,6 @@
       <w:pPr>
         <w:ind w:firstLine="0"/>
         <w:jc w:val="center"/>
-        <w:rPr>
-          <w:lang/>
-        </w:rPr>
       </w:pPr>
     </w:p>
     <w:p>
@@ -7921,11 +7759,14 @@
         <w:jc w:val="center"/>
       </w:pPr>
       <w:r>
+        <w:rPr>
+          <w:noProof/>
+        </w:rPr>
         <w:drawing>
-          <wp:inline distT="0" distB="0" distL="0" distR="0" wp14:anchorId="785C05EE" wp14:editId="7D5C7C09">
-            <wp:extent cx="5940425" cy="3843655"/>
-            <wp:effectExtent l="0" t="0" r="3175" b="4445"/>
-            <wp:docPr id="1652455707" name="Рисунок 1"/>
+          <wp:inline distT="0" distB="0" distL="0" distR="0" wp14:anchorId="619D97D1" wp14:editId="447F5203">
+            <wp:extent cx="5650173" cy="3516334"/>
+            <wp:effectExtent l="0" t="0" r="8255" b="8255"/>
+            <wp:docPr id="1633110287" name="Рисунок 1"/>
             <wp:cNvGraphicFramePr>
               <a:graphicFrameLocks xmlns:a="http://schemas.openxmlformats.org/drawingml/2006/main" noChangeAspect="1"/>
             </wp:cNvGraphicFramePr>
@@ -7933,7 +7774,7 @@
               <a:graphicData uri="http://schemas.openxmlformats.org/drawingml/2006/picture">
                 <pic:pic xmlns:pic="http://schemas.openxmlformats.org/drawingml/2006/picture">
                   <pic:nvPicPr>
-                    <pic:cNvPr id="1652455707" name=""/>
+                    <pic:cNvPr id="1633110287" name=""/>
                     <pic:cNvPicPr/>
                   </pic:nvPicPr>
                   <pic:blipFill>
@@ -7945,7 +7786,7 @@
                   <pic:spPr>
                     <a:xfrm>
                       <a:off x="0" y="0"/>
-                      <a:ext cx="5940425" cy="3843655"/>
+                      <a:ext cx="5654692" cy="3519147"/>
                     </a:xfrm>
                     <a:prstGeom prst="rect">
                       <a:avLst/>
@@ -8004,6 +7845,9 @@
         <w:jc w:val="center"/>
       </w:pPr>
       <w:r>
+        <w:rPr>
+          <w:noProof/>
+        </w:rPr>
         <w:lastRenderedPageBreak/>
         <w:drawing>
           <wp:inline distT="0" distB="0" distL="0" distR="0" wp14:anchorId="2029B34A" wp14:editId="035AA5DE">
@@ -8056,22 +7900,13 @@
         <w:t>Рисунок 3.</w:t>
       </w:r>
       <w:r>
-        <w:t>1</w:t>
-      </w:r>
-      <w:r>
-        <w:t>3</w:t>
+        <w:t>13</w:t>
       </w:r>
       <w:r>
         <w:t xml:space="preserve"> – </w:t>
       </w:r>
       <w:r>
-        <w:t>Окно</w:t>
-      </w:r>
-      <w:r>
-        <w:t xml:space="preserve"> создания</w:t>
-      </w:r>
-      <w:r>
-        <w:t xml:space="preserve"> чата</w:t>
+        <w:t>Окно создания чата</w:t>
       </w:r>
     </w:p>
     <w:p>
@@ -8083,55 +7918,34 @@
     <w:p>
       <w:pPr>
         <w:spacing w:line="360" w:lineRule="exact"/>
-        <w:rPr>
-          <w:lang/>
-        </w:rPr>
-      </w:pPr>
-      <w:r>
-        <w:rPr>
-          <w:lang/>
-        </w:rPr>
+      </w:pPr>
+      <w:r>
         <w:t>Персонализация учетной записи осуществляется через интерфейс настроек профиля. Данный раздел позволяет пользователю актуализировать свои персональные данные: изменять отображаемое имя</w:t>
       </w:r>
       <w:r>
         <w:t>,</w:t>
       </w:r>
       <w:r>
-        <w:rPr>
-          <w:lang/>
-        </w:rPr>
         <w:t xml:space="preserve"> управлять уникальным идентификатором пользователя</w:t>
       </w:r>
       <w:r>
         <w:t xml:space="preserve"> и изменять аватар</w:t>
       </w:r>
       <w:r>
-        <w:rPr>
-          <w:lang/>
-        </w:rPr>
         <w:t>.</w:t>
       </w:r>
     </w:p>
     <w:p>
       <w:pPr>
         <w:spacing w:line="360" w:lineRule="exact"/>
-        <w:rPr>
-          <w:lang/>
-        </w:rPr>
-      </w:pPr>
-      <w:r>
-        <w:rPr>
-          <w:lang/>
-        </w:rPr>
+      </w:pPr>
+      <w:r>
         <w:t>Технически форма редактирования тесно интегрирована с сервисом управления состоянием. При внесении изменений данные отправляются на сервер через соответствующий эндпоинт API, после чего глобальный объект пользователя в хранилище приложения синхронизируется с обновленным ответом от сервера. Это позволяет избежать несоответствия данных: например, новое имя пользователя мгновенно отображается во всех активных чатах и сайдбаре без необходимости перезагрузки страницы.</w:t>
       </w:r>
     </w:p>
     <w:p>
       <w:pPr>
         <w:ind w:firstLine="0"/>
-        <w:rPr>
-          <w:lang/>
-        </w:rPr>
       </w:pPr>
     </w:p>
     <w:p>
@@ -8139,6 +7953,9 @@
         <w:jc w:val="center"/>
       </w:pPr>
       <w:r>
+        <w:rPr>
+          <w:noProof/>
+        </w:rPr>
         <w:drawing>
           <wp:inline distT="0" distB="0" distL="0" distR="0" wp14:anchorId="2A6A5B24" wp14:editId="7A9DCA59">
             <wp:extent cx="2206910" cy="2975212"/>
@@ -8190,19 +8007,13 @@
         <w:t>Рисунок 3.</w:t>
       </w:r>
       <w:r>
-        <w:t>1</w:t>
-      </w:r>
-      <w:r>
-        <w:t>4</w:t>
+        <w:t>14</w:t>
       </w:r>
       <w:r>
         <w:t xml:space="preserve"> – </w:t>
       </w:r>
       <w:r>
-        <w:t xml:space="preserve">Окно </w:t>
-      </w:r>
-      <w:r>
-        <w:t>изменения профиля</w:t>
+        <w:t>Окно изменения профиля</w:t>
       </w:r>
     </w:p>
     <w:p>
@@ -8216,7 +8027,6 @@
           <w:color w:val="000000" w:themeColor="text1"/>
           <w:sz w:val="28"/>
           <w:szCs w:val="28"/>
-          <w:lang/>
         </w:rPr>
       </w:pPr>
       <w:bookmarkStart w:id="22" w:name="_Toc228216031"/>
@@ -8228,32 +8038,173 @@
           <w:color w:val="000000" w:themeColor="text1"/>
           <w:sz w:val="28"/>
           <w:szCs w:val="28"/>
-          <w:lang/>
         </w:rPr>
         <w:lastRenderedPageBreak/>
-        <w:t>4 РАЗВЕРТЫВАНИЕ И ТЕСТИРОВАНИЕ</w:t>
+        <w:t>4 ТЕСТИРОВАНИЕ</w:t>
       </w:r>
       <w:bookmarkEnd w:id="22"/>
     </w:p>
+    <w:p/>
+    <w:p>
+      <w:bookmarkStart w:id="23" w:name="_Toc228216032"/>
+      <w:r>
+        <w:t xml:space="preserve">Тестирование является важным этапом разработки программного обеспечения, поскольку позволяет убедиться в корректности работы системы, своевременно выявить ошибки и повысить надежность приложения. </w:t>
+      </w:r>
+    </w:p>
+    <w:p>
+      <w:r>
+        <w:t xml:space="preserve">В рамках данной курсовой работы для автоматизированного тестирования использовалась технология </w:t>
+      </w:r>
+      <w:proofErr w:type="spellStart"/>
+      <w:r>
+        <w:t>xUnit</w:t>
+      </w:r>
+      <w:proofErr w:type="spellEnd"/>
+      <w:r>
+        <w:t xml:space="preserve"> </w:t>
+      </w:r>
+      <w:r>
+        <w:t>[12]</w:t>
+      </w:r>
+      <w:r>
+        <w:t xml:space="preserve">, предназначенная для написания </w:t>
+      </w:r>
+      <w:proofErr w:type="spellStart"/>
+      <w:r>
+        <w:t>unit</w:t>
+      </w:r>
+      <w:proofErr w:type="spellEnd"/>
+      <w:r>
+        <w:t xml:space="preserve">-тестов в среде .NET. Дополнительно применялись библиотеки </w:t>
+      </w:r>
+      <w:proofErr w:type="spellStart"/>
+      <w:r>
+        <w:t>Moq</w:t>
+      </w:r>
+      <w:proofErr w:type="spellEnd"/>
+      <w:r>
+        <w:t xml:space="preserve"> для создания </w:t>
+      </w:r>
+      <w:proofErr w:type="spellStart"/>
+      <w:r>
+        <w:t>mock</w:t>
+      </w:r>
+      <w:proofErr w:type="spellEnd"/>
+      <w:r>
+        <w:t xml:space="preserve">-объектов и </w:t>
+      </w:r>
+      <w:proofErr w:type="spellStart"/>
+      <w:r>
+        <w:t>FluentAssertions</w:t>
+      </w:r>
+      <w:proofErr w:type="spellEnd"/>
+      <w:r>
+        <w:t xml:space="preserve"> для более удобной и читаемой проверки результатов тестирования. </w:t>
+      </w:r>
+    </w:p>
+    <w:p>
+      <w:r>
+        <w:t xml:space="preserve">В ходе работы были протестированы доменные сущности системы, включая пользователей, чаты, сообщения и участников чатов, что позволило проверить корректность бизнес-логики, валидации данных и обработки исключительных ситуаций. Также были протестированы </w:t>
+      </w:r>
+      <w:proofErr w:type="spellStart"/>
+      <w:r>
+        <w:t>use</w:t>
+      </w:r>
+      <w:proofErr w:type="spellEnd"/>
+      <w:r>
+        <w:t xml:space="preserve"> </w:t>
+      </w:r>
+      <w:proofErr w:type="spellStart"/>
+      <w:r>
+        <w:t>cases</w:t>
+      </w:r>
+      <w:proofErr w:type="spellEnd"/>
+      <w:r>
+        <w:t xml:space="preserve"> (</w:t>
+      </w:r>
+      <w:proofErr w:type="spellStart"/>
+      <w:r>
+        <w:t>handlers</w:t>
+      </w:r>
+      <w:proofErr w:type="spellEnd"/>
+      <w:r>
+        <w:t>), реализующие основные сценарии работы приложения: авторизацию и регистрацию пользователей, отправку сообщений и файлов, управление чатами, изменение профиля пользователя и получение данных. Тестирование охватывало как успешные сценарии выполнения операций, так и обработку ошибочных ситуаций, включая некорректные входные данные, дублирование сущностей и ограничения бизнес-логики. Полученные результаты подтвердили корректность работы реализованной системы и устойчивость приложения к различным типам ошибок.</w:t>
+      </w:r>
+    </w:p>
+    <w:p/>
     <w:p>
       <w:pPr>
         <w:jc w:val="center"/>
-      </w:pPr>
-    </w:p>
-    <w:p>
-      <w:r>
-        <w:t>Тут вставлю скриншот тестов, дам информацию о развертывании, поясню важность тестирования ПО.</w:t>
-      </w:r>
-    </w:p>
-    <w:p>
-      <w:pPr>
-        <w:widowControl/>
-        <w:spacing w:after="160" w:line="278" w:lineRule="auto"/>
+        <w:rPr>
+          <w:lang w:val="en-US"/>
+        </w:rPr>
+      </w:pPr>
+      <w:r>
+        <w:rPr>
+          <w:noProof/>
+          <w:lang w:val="en-US"/>
+        </w:rPr>
+        <w:drawing>
+          <wp:inline distT="0" distB="0" distL="0" distR="0" wp14:anchorId="390704CB" wp14:editId="2723B31B">
+            <wp:extent cx="3700133" cy="3132161"/>
+            <wp:effectExtent l="0" t="0" r="0" b="0"/>
+            <wp:docPr id="1372239677" name="Рисунок 1"/>
+            <wp:cNvGraphicFramePr>
+              <a:graphicFrameLocks xmlns:a="http://schemas.openxmlformats.org/drawingml/2006/main" noChangeAspect="1"/>
+            </wp:cNvGraphicFramePr>
+            <a:graphic xmlns:a="http://schemas.openxmlformats.org/drawingml/2006/main">
+              <a:graphicData uri="http://schemas.openxmlformats.org/drawingml/2006/picture">
+                <pic:pic xmlns:pic="http://schemas.openxmlformats.org/drawingml/2006/picture">
+                  <pic:nvPicPr>
+                    <pic:cNvPr id="1372239677" name=""/>
+                    <pic:cNvPicPr/>
+                  </pic:nvPicPr>
+                  <pic:blipFill>
+                    <a:blip r:embed="rId33"/>
+                    <a:stretch>
+                      <a:fillRect/>
+                    </a:stretch>
+                  </pic:blipFill>
+                  <pic:spPr>
+                    <a:xfrm>
+                      <a:off x="0" y="0"/>
+                      <a:ext cx="3713156" cy="3143185"/>
+                    </a:xfrm>
+                    <a:prstGeom prst="rect">
+                      <a:avLst/>
+                    </a:prstGeom>
+                  </pic:spPr>
+                </pic:pic>
+              </a:graphicData>
+            </a:graphic>
+          </wp:inline>
+        </w:drawing>
+      </w:r>
+    </w:p>
+    <w:p>
+      <w:pPr>
+        <w:jc w:val="center"/>
+        <w:rPr>
+          <w:lang w:val="en-US"/>
+        </w:rPr>
+      </w:pPr>
+    </w:p>
+    <w:p>
+      <w:pPr>
         <w:ind w:firstLine="0"/>
-        <w:jc w:val="left"/>
-      </w:pPr>
-      <w:r>
-        <w:br w:type="page"/>
+        <w:jc w:val="center"/>
+      </w:pPr>
+      <w:r>
+        <w:t>Рисунок 3.</w:t>
+      </w:r>
+      <w:r>
+        <w:t>15</w:t>
+      </w:r>
+      <w:r>
+        <w:t xml:space="preserve"> – </w:t>
+      </w:r>
+      <w:r>
+        <w:t>Отчет о тестировании приложения</w:t>
       </w:r>
     </w:p>
     <w:p>
@@ -8269,7 +8220,6 @@
           <w:szCs w:val="28"/>
         </w:rPr>
       </w:pPr>
-      <w:bookmarkStart w:id="23" w:name="_Toc228216032"/>
       <w:r>
         <w:rPr>
           <w:rFonts w:ascii="Times New Roman" w:hAnsi="Times New Roman" w:cs="Times New Roman"/>
@@ -8287,18 +8237,28 @@
     <w:p/>
     <w:p>
       <w:r>
-        <w:t>Тут будет заключение.</w:t>
-      </w:r>
-    </w:p>
-    <w:p>
-      <w:pPr>
-        <w:widowControl/>
-        <w:spacing w:after="160" w:line="278" w:lineRule="auto"/>
-        <w:ind w:firstLine="0"/>
-        <w:jc w:val="left"/>
-      </w:pPr>
-      <w:r>
-        <w:br w:type="page"/>
+        <w:t>В ходе выполнения курсового проекта была успешно разработана и реализована клиент-серверная архитектура современного многопользовательского чат-приложения. При проектировании и разработке системы особое внимание уделялось обеспечению высокой производительности, отзывчивости интерфейса и масштабируемости компонентов. Программный комплекс построен на базе разделения зон ответственности между бэкенд-сервером и фронтенд-клиентом, что позволило достичь гибкости управления данными и высокого уровня безопасности.</w:t>
+      </w:r>
+    </w:p>
+    <w:p>
+      <w:r>
+        <w:t xml:space="preserve">В качестве технологического стека для разработки серверной части был выбран фреймворк .NET </w:t>
+      </w:r>
+      <w:r>
+        <w:t>10</w:t>
+      </w:r>
+      <w:r>
+        <w:t xml:space="preserve"> с использованием объектно-реляционного маппера Entity Framework Core и СУБД PostgreSQL. Архитектура сервера спроектирована на основе принципов Clean Architecture и шаблона CQRS с применением библиотеки MediatR, что обеспечило строгую изоляцию операций чтения и изменения данных. В качестве основного инструмента для обеспечения real-time взаимодействия и мгновенного обмена сообщениями была интегрирована технология SignalR, реализующая постоянное полнодуплексное сокет-соединение между клиентами и сервером. Для защиты пользовательских данных и авторизации запросов была внедрена аутентификация на базе JWT-токенов.</w:t>
+      </w:r>
+    </w:p>
+    <w:p>
+      <w:r>
+        <w:t>Клиентское приложение реализовано на базе современной библиотеки React с использованием компилируемой среды TypeScript, гарантирующей строгую типизацию и минимизацию ошибок в коде. Архитектура управления состоянием на фронтенде построена на базе легковесного стейт-менеджера Zustand, обеспечивающего синхронное обновление интерфейса и кэширование локальных данных. Дизайн приложения выполнен с использованием компонентного подхода.</w:t>
+      </w:r>
+    </w:p>
+    <w:p>
+      <w:r>
+        <w:t>В рамках практической реализации проекта был создан полнофункциональный программный продукт, поддерживающий динамическую авторизацию, создание групповых чатов, каналов и персональных диалогов. Разработана и отлажена комплексная система обработки сообщений, включающая их мгновенную отправку, синхронное обновление содержимого, а также функционал закрепления важных сообщений и ответов на них. Реализована оптимистичная отправка текстового контента на стороне клиента, что существенно повысило плавность и скорость отклика интерфейса. Работа завершена успешным тестированием всех модулей системы в условиях одновременной работы нескольких изолированных сессий пользователей.</w:t>
       </w:r>
     </w:p>
     <w:p>
@@ -8376,13 +8336,580 @@
     </w:p>
     <w:p/>
     <w:p>
-      <w:r>
-        <w:t>Тут приведу использованную литературу.</w:t>
-      </w:r>
+      <w:pPr>
+        <w:spacing w:line="360" w:lineRule="exact"/>
+        <w:rPr>
+          <w:lang/>
+        </w:rPr>
+      </w:pPr>
+      <w:r>
+        <w:rPr>
+          <w:lang/>
+        </w:rPr>
+        <w:t xml:space="preserve">[1] </w:t>
+      </w:r>
+      <w:r>
+        <w:t xml:space="preserve">Доманов, А. Т. Стандарт предприятия / А. Т. Доманов, Н. И. Сорока. – </w:t>
+      </w:r>
+      <w:r>
+        <w:t>Минск:</w:t>
+      </w:r>
+      <w:r>
+        <w:t xml:space="preserve"> БГУИР, 2024. – 178 с.</w:t>
+      </w:r>
+    </w:p>
+    <w:p>
+      <w:pPr>
+        <w:spacing w:line="360" w:lineRule="exact"/>
+        <w:rPr>
+          <w:lang/>
+        </w:rPr>
+      </w:pPr>
+      <w:r>
+        <w:rPr>
+          <w:lang/>
+        </w:rPr>
+        <w:t xml:space="preserve">[2] ASP.NET Core Documentation [Электронный ресурс] / Microsoft. – Режим доступа : </w:t>
+      </w:r>
+      <w:hyperlink r:id="rId34" w:tgtFrame="_new" w:history="1">
+        <w:r>
+          <w:rPr>
+            <w:rStyle w:val="af1"/>
+            <w:lang/>
+          </w:rPr>
+          <w:t>https://learn.microsoft.co</w:t>
+        </w:r>
+        <w:r>
+          <w:rPr>
+            <w:rStyle w:val="af1"/>
+            <w:lang/>
+          </w:rPr>
+          <w:t>m</w:t>
+        </w:r>
+        <w:r>
+          <w:rPr>
+            <w:rStyle w:val="af1"/>
+            <w:lang/>
+          </w:rPr>
+          <w:t>/en-us/aspnet/core/</w:t>
+        </w:r>
+      </w:hyperlink>
+      <w:r>
+        <w:rPr>
+          <w:lang/>
+        </w:rPr>
+        <w:t xml:space="preserve">. – Дата обращения : </w:t>
+      </w:r>
+      <w:r>
+        <w:t>20</w:t>
+      </w:r>
+      <w:r>
+        <w:rPr>
+          <w:lang/>
+        </w:rPr>
+        <w:t>.0</w:t>
+      </w:r>
+      <w:r>
+        <w:t>4</w:t>
+      </w:r>
+      <w:r>
+        <w:rPr>
+          <w:lang/>
+        </w:rPr>
+        <w:t>.2026.</w:t>
+      </w:r>
+    </w:p>
+    <w:p>
+      <w:pPr>
+        <w:spacing w:line="360" w:lineRule="exact"/>
+        <w:rPr>
+          <w:lang/>
+        </w:rPr>
+      </w:pPr>
+      <w:r>
+        <w:rPr>
+          <w:lang/>
+        </w:rPr>
+        <w:t xml:space="preserve">[3] SignalR Documentation [Электронный ресурс] / Microsoft. – Режим доступа : </w:t>
+      </w:r>
+      <w:hyperlink r:id="rId35" w:tgtFrame="_new" w:history="1">
+        <w:r>
+          <w:rPr>
+            <w:rStyle w:val="af1"/>
+            <w:lang/>
+          </w:rPr>
+          <w:t>https://learn.microsoft.com/en-u</w:t>
+        </w:r>
+        <w:r>
+          <w:rPr>
+            <w:rStyle w:val="af1"/>
+            <w:lang/>
+          </w:rPr>
+          <w:t>s</w:t>
+        </w:r>
+        <w:r>
+          <w:rPr>
+            <w:rStyle w:val="af1"/>
+            <w:lang/>
+          </w:rPr>
+          <w:t>/aspnet/core/signalr/</w:t>
+        </w:r>
+      </w:hyperlink>
+      <w:r>
+        <w:rPr>
+          <w:lang/>
+        </w:rPr>
+        <w:t xml:space="preserve">. – Дата обращения : </w:t>
+      </w:r>
+      <w:r>
+        <w:t>21</w:t>
+      </w:r>
+      <w:r>
+        <w:rPr>
+          <w:lang/>
+        </w:rPr>
+        <w:t>.0</w:t>
+      </w:r>
+      <w:r>
+        <w:t>4</w:t>
+      </w:r>
+      <w:r>
+        <w:rPr>
+          <w:lang/>
+        </w:rPr>
+        <w:t>.2026.</w:t>
+      </w:r>
+    </w:p>
+    <w:p>
+      <w:pPr>
+        <w:spacing w:line="360" w:lineRule="exact"/>
+        <w:rPr>
+          <w:lang/>
+        </w:rPr>
+      </w:pPr>
+      <w:r>
+        <w:rPr>
+          <w:lang/>
+        </w:rPr>
+        <w:t xml:space="preserve">[4] PostgreSQL Documentation [Электронный ресурс] / PostgreSQL Global Development Group. – Режим доступа : </w:t>
+      </w:r>
+      <w:hyperlink r:id="rId36" w:tgtFrame="_new" w:history="1">
+        <w:r>
+          <w:rPr>
+            <w:rStyle w:val="af1"/>
+            <w:lang/>
+          </w:rPr>
+          <w:t>https://www.po</w:t>
+        </w:r>
+        <w:r>
+          <w:rPr>
+            <w:rStyle w:val="af1"/>
+            <w:lang/>
+          </w:rPr>
+          <w:t>s</w:t>
+        </w:r>
+        <w:r>
+          <w:rPr>
+            <w:rStyle w:val="af1"/>
+            <w:lang/>
+          </w:rPr>
+          <w:t>tgresql.org/docs/</w:t>
+        </w:r>
+      </w:hyperlink>
+      <w:r>
+        <w:rPr>
+          <w:lang/>
+        </w:rPr>
+        <w:t xml:space="preserve">. – Дата обращения : </w:t>
+      </w:r>
+      <w:r>
+        <w:rPr>
+          <w:lang/>
+        </w:rPr>
+        <w:t>21</w:t>
+      </w:r>
+      <w:r>
+        <w:rPr>
+          <w:lang/>
+        </w:rPr>
+        <w:t>.0</w:t>
+      </w:r>
+      <w:r>
+        <w:rPr>
+          <w:lang/>
+        </w:rPr>
+        <w:t>4</w:t>
+      </w:r>
+      <w:r>
+        <w:rPr>
+          <w:lang/>
+        </w:rPr>
+        <w:t>.2026.</w:t>
+      </w:r>
+    </w:p>
+    <w:p>
+      <w:pPr>
+        <w:spacing w:line="360" w:lineRule="exact"/>
+        <w:rPr>
+          <w:lang/>
+        </w:rPr>
+      </w:pPr>
+      <w:r>
+        <w:rPr>
+          <w:lang/>
+        </w:rPr>
+        <w:t xml:space="preserve">[5] Entity Framework Core Documentation [Электронный ресурс] / Microsoft. – Режим доступа : </w:t>
+      </w:r>
+      <w:hyperlink r:id="rId37" w:tgtFrame="_new" w:history="1">
+        <w:r>
+          <w:rPr>
+            <w:rStyle w:val="af1"/>
+            <w:lang/>
+          </w:rPr>
+          <w:t>https://learn.microsoft.com/en-us/ef/core/</w:t>
+        </w:r>
+      </w:hyperlink>
+      <w:r>
+        <w:rPr>
+          <w:lang/>
+        </w:rPr>
+        <w:t xml:space="preserve">. – Дата обращения : </w:t>
+      </w:r>
+      <w:r>
+        <w:rPr>
+          <w:lang/>
+        </w:rPr>
+        <w:t>20</w:t>
+      </w:r>
+      <w:r>
+        <w:rPr>
+          <w:lang/>
+        </w:rPr>
+        <w:t>.0</w:t>
+      </w:r>
+      <w:r>
+        <w:rPr>
+          <w:lang/>
+        </w:rPr>
+        <w:t>4</w:t>
+      </w:r>
+      <w:r>
+        <w:rPr>
+          <w:lang/>
+        </w:rPr>
+        <w:t>.2026.</w:t>
+      </w:r>
+    </w:p>
+    <w:p>
+      <w:pPr>
+        <w:spacing w:line="360" w:lineRule="exact"/>
+        <w:rPr>
+          <w:lang/>
+        </w:rPr>
+      </w:pPr>
+      <w:r>
+        <w:rPr>
+          <w:lang/>
+        </w:rPr>
+        <w:t>[6] Martin, R. C. Clean Architecture : A Craftsman’s Guide to Software Structure and Design / R. C. Martin. – Boston : Pearson, 2017. – 432 p.</w:t>
+      </w:r>
+    </w:p>
+    <w:p>
+      <w:pPr>
+        <w:spacing w:line="360" w:lineRule="exact"/>
+        <w:rPr>
+          <w:lang/>
+        </w:rPr>
+      </w:pPr>
+      <w:r>
+        <w:rPr>
+          <w:lang/>
+        </w:rPr>
+        <w:t xml:space="preserve">[7] CQRS Pattern [Электронный ресурс] / Microsoft Azure Architecture Center. – Режим доступа : </w:t>
+      </w:r>
+      <w:hyperlink r:id="rId38" w:tgtFrame="_new" w:history="1">
+        <w:r>
+          <w:rPr>
+            <w:rStyle w:val="af1"/>
+            <w:lang/>
+          </w:rPr>
+          <w:t>https://learn.micro</w:t>
+        </w:r>
+        <w:r>
+          <w:rPr>
+            <w:rStyle w:val="af1"/>
+            <w:lang/>
+          </w:rPr>
+          <w:t>s</w:t>
+        </w:r>
+        <w:r>
+          <w:rPr>
+            <w:rStyle w:val="af1"/>
+            <w:lang/>
+          </w:rPr>
+          <w:t>oft.com/en-us/azure/architecture/patterns/cqrs</w:t>
+        </w:r>
+      </w:hyperlink>
+      <w:r>
+        <w:rPr>
+          <w:lang/>
+        </w:rPr>
+        <w:t xml:space="preserve">. – Дата обращения : </w:t>
+      </w:r>
+      <w:r>
+        <w:rPr>
+          <w:lang/>
+        </w:rPr>
+        <w:t>23</w:t>
+      </w:r>
+      <w:r>
+        <w:rPr>
+          <w:lang/>
+        </w:rPr>
+        <w:t>.0</w:t>
+      </w:r>
+      <w:r>
+        <w:rPr>
+          <w:lang/>
+        </w:rPr>
+        <w:t>4</w:t>
+      </w:r>
+      <w:r>
+        <w:rPr>
+          <w:lang/>
+        </w:rPr>
+        <w:t>.2026.</w:t>
+      </w:r>
+    </w:p>
+    <w:p>
+      <w:pPr>
+        <w:spacing w:line="360" w:lineRule="exact"/>
+        <w:rPr>
+          <w:lang/>
+        </w:rPr>
+      </w:pPr>
+      <w:r>
+        <w:rPr>
+          <w:lang/>
+        </w:rPr>
+        <w:t xml:space="preserve">[8] MediatR [Электронный ресурс]. – Режим доступа : </w:t>
+      </w:r>
+      <w:hyperlink r:id="rId39" w:tgtFrame="_new" w:history="1">
+        <w:r>
+          <w:rPr>
+            <w:rStyle w:val="af1"/>
+            <w:lang/>
+          </w:rPr>
+          <w:t>https://mediatr.io/</w:t>
+        </w:r>
+      </w:hyperlink>
+      <w:r>
+        <w:rPr>
+          <w:lang/>
+        </w:rPr>
+        <w:t xml:space="preserve">. – Дата обращения : </w:t>
+      </w:r>
+      <w:r>
+        <w:t>23</w:t>
+      </w:r>
+      <w:r>
+        <w:rPr>
+          <w:lang/>
+        </w:rPr>
+        <w:t>.0</w:t>
+      </w:r>
+      <w:r>
+        <w:t>4</w:t>
+      </w:r>
+      <w:r>
+        <w:rPr>
+          <w:lang/>
+        </w:rPr>
+        <w:t>.2026.</w:t>
+      </w:r>
+    </w:p>
+    <w:p>
+      <w:pPr>
+        <w:spacing w:line="360" w:lineRule="exact"/>
+        <w:rPr>
+          <w:lang/>
+        </w:rPr>
+      </w:pPr>
+      <w:r>
+        <w:rPr>
+          <w:lang/>
+        </w:rPr>
+        <w:t xml:space="preserve">[9] React Documentation [Электронный ресурс]. – Режим доступа : </w:t>
+      </w:r>
+      <w:hyperlink r:id="rId40" w:tgtFrame="_new" w:history="1">
+        <w:r>
+          <w:rPr>
+            <w:rStyle w:val="af1"/>
+            <w:lang/>
+          </w:rPr>
+          <w:t>https://react.dev/</w:t>
+        </w:r>
+      </w:hyperlink>
+      <w:r>
+        <w:rPr>
+          <w:lang/>
+        </w:rPr>
+        <w:t xml:space="preserve">. – Дата обращения : </w:t>
+      </w:r>
+      <w:r>
+        <w:t>02</w:t>
+      </w:r>
+      <w:r>
+        <w:rPr>
+          <w:lang/>
+        </w:rPr>
+        <w:t>.05.2026.</w:t>
+      </w:r>
+    </w:p>
+    <w:p>
+      <w:pPr>
+        <w:spacing w:line="360" w:lineRule="exact"/>
+        <w:rPr>
+          <w:lang/>
+        </w:rPr>
+      </w:pPr>
+      <w:r>
+        <w:rPr>
+          <w:lang/>
+        </w:rPr>
+        <w:t xml:space="preserve">[10] ASP.NET Core Identity and Authentication [Электронный ресурс] / Microsoft. – Режим доступа : </w:t>
+      </w:r>
+      <w:hyperlink r:id="rId41" w:tgtFrame="_new" w:history="1">
+        <w:r>
+          <w:rPr>
+            <w:rStyle w:val="af1"/>
+            <w:lang/>
+          </w:rPr>
+          <w:t>https</w:t>
+        </w:r>
+        <w:r>
+          <w:rPr>
+            <w:rStyle w:val="af1"/>
+            <w:lang/>
+          </w:rPr>
+          <w:t>:</w:t>
+        </w:r>
+        <w:r>
+          <w:rPr>
+            <w:rStyle w:val="af1"/>
+            <w:lang/>
+          </w:rPr>
+          <w:t>//learn.microsoft.com/en-us/aspnet/core/security/authentication/</w:t>
+        </w:r>
+      </w:hyperlink>
+      <w:r>
+        <w:rPr>
+          <w:lang/>
+        </w:rPr>
+        <w:t xml:space="preserve">. – Дата обращения : </w:t>
+      </w:r>
+      <w:r>
+        <w:rPr>
+          <w:lang/>
+        </w:rPr>
+        <w:t>20</w:t>
+      </w:r>
+      <w:r>
+        <w:rPr>
+          <w:lang/>
+        </w:rPr>
+        <w:t>.0</w:t>
+      </w:r>
+      <w:r>
+        <w:rPr>
+          <w:lang/>
+        </w:rPr>
+        <w:t>4</w:t>
+      </w:r>
+      <w:r>
+        <w:rPr>
+          <w:lang/>
+        </w:rPr>
+        <w:t>.2026.</w:t>
+      </w:r>
+    </w:p>
+    <w:p>
+      <w:pPr>
+        <w:spacing w:line="360" w:lineRule="exact"/>
+        <w:rPr>
+          <w:lang/>
+        </w:rPr>
+      </w:pPr>
+      <w:r>
+        <w:rPr>
+          <w:lang/>
+        </w:rPr>
+        <w:t>[11] Fowler, M. Patterns of Enterprise Application Architecture / M. Fowler. – Boston : Addison-Wesley, 2002. – 560 p.</w:t>
+      </w:r>
+    </w:p>
+    <w:p>
+      <w:pPr>
+        <w:spacing w:line="360" w:lineRule="exact"/>
+        <w:rPr>
+          <w:lang/>
+        </w:rPr>
+      </w:pPr>
+      <w:r>
+        <w:rPr>
+          <w:lang/>
+        </w:rPr>
+        <w:t xml:space="preserve">[12] Unit testing C# with xUnit [Электронный ресурс] / Microsoft. – Режим доступа : </w:t>
+      </w:r>
+      <w:hyperlink r:id="rId42" w:tgtFrame="_new" w:history="1">
+        <w:r>
+          <w:rPr>
+            <w:rStyle w:val="af1"/>
+            <w:lang/>
+          </w:rPr>
+          <w:t>https://learn.microsoft.com/en-us/dotnet/core</w:t>
+        </w:r>
+        <w:r>
+          <w:rPr>
+            <w:rStyle w:val="af1"/>
+            <w:lang/>
+          </w:rPr>
+          <w:t>/</w:t>
+        </w:r>
+        <w:r>
+          <w:rPr>
+            <w:rStyle w:val="af1"/>
+            <w:lang/>
+          </w:rPr>
+          <w:t>testing/unit-testing-csharp-with-xunit</w:t>
+        </w:r>
+      </w:hyperlink>
+      <w:r>
+        <w:rPr>
+          <w:lang/>
+        </w:rPr>
+        <w:t>. – Дата обращения : 1</w:t>
+      </w:r>
+      <w:r>
+        <w:t>5</w:t>
+      </w:r>
+      <w:r>
+        <w:rPr>
+          <w:lang/>
+        </w:rPr>
+        <w:t>.05.2026.</w:t>
+      </w:r>
+    </w:p>
+    <w:p>
+      <w:pPr>
+        <w:spacing w:line="360" w:lineRule="exact"/>
+        <w:rPr>
+          <w:lang/>
+        </w:rPr>
+      </w:pPr>
     </w:p>
     <w:sectPr>
-      <w:footerReference w:type="default" r:id="rId33"/>
-      <w:footerReference w:type="first" r:id="rId34"/>
+      <w:footerReference w:type="default" r:id="rId43"/>
+      <w:footerReference w:type="first" r:id="rId44"/>
       <w:pgSz w:w="11906" w:h="16838"/>
       <w:pgMar w:top="1134" w:right="850" w:bottom="1134" w:left="1701" w:header="708" w:footer="567" w:gutter="0"/>
       <w:pgNumType w:start="5"/>
@@ -9904,6 +10431,18 @@
       <w:ind w:left="560"/>
     </w:pPr>
   </w:style>
+  <w:style w:type="character" w:styleId="af5">
+    <w:name w:val="FollowedHyperlink"/>
+    <w:basedOn w:val="a0"/>
+    <w:uiPriority w:val="99"/>
+    <w:semiHidden/>
+    <w:unhideWhenUsed/>
+    <w:rsid w:val="00BC3D30"/>
+    <w:rPr>
+      <w:color w:val="96607D" w:themeColor="followedHyperlink"/>
+      <w:u w:val="single"/>
+    </w:rPr>
+  </w:style>
 </w:styles>
 </file>
 

</xml_diff>